<commit_message>
Rebuild btch.docx to match reference image format exactly
Agent-Logs-Url: https://github.com/3dward22/medy-care/sessions/f02fd763-4a31-4d41-a2e2-942eb7c0fe8e

Co-authored-by: 3dward22 <159800005+3dward22@users.noreply.github.com>
</commit_message>
<xml_diff>
--- a/btch.docx
+++ b/btch.docx
@@ -9,13 +9,18 @@
       </w:pPr>
       <w:r>
         <w:rPr>
-          <w:color w:val="4A7C59"/>
+          <w:b/>
+          <w:i w:val="0"/>
+          <w:color w:val="596B3B"/>
+          <w:sz w:val="28"/>
+          <w:u w:val="none"/>
         </w:rPr>
         <w:t>Product Backlog</w:t>
       </w:r>
     </w:p>
     <w:p>
       <w:pPr>
+        <w:spacing w:after="120"/>
         <w:jc w:val="both"/>
       </w:pPr>
       <w:r>
@@ -24,12 +29,14 @@
     </w:p>
     <w:p>
       <w:pPr>
+        <w:spacing w:before="80" w:after="80"/>
         <w:jc w:val="center"/>
       </w:pPr>
       <w:r>
         <w:rPr>
           <w:b w:val="0"/>
           <w:i w:val="0"/>
+          <w:u w:val="none"/>
         </w:rPr>
         <w:t xml:space="preserve">Table 4: </w:t>
       </w:r>
@@ -37,7 +44,8 @@
         <w:rPr>
           <w:b/>
           <w:i w:val="0"/>
-          <w:color w:val="4A7C59"/>
+          <w:color w:val="596B3B"/>
+          <w:u w:val="single"/>
         </w:rPr>
         <w:t>Product Backlog</w:t>
       </w:r>
@@ -56,11 +64,20 @@
       <w:tr>
         <w:tc>
           <w:tcPr>
-            <w:tcW w:type="dxa" w:w="1984"/>
-            <w:shd w:val="clear" w:color="auto" w:fill="70AD47"/>
+            <w:tcW w:type="dxa" w:w="2154"/>
+            <w:shd w:val="clear" w:color="auto" w:fill="7F9443"/>
+            <w:tcBorders>
+              <w:top w:val="single" w:sz="4" w:space="0" w:color="596B3B"/>
+              <w:left w:val="single" w:sz="4" w:space="0" w:color="596B3B"/>
+              <w:bottom w:val="single" w:sz="4" w:space="0" w:color="596B3B"/>
+              <w:right w:val="single" w:sz="4" w:space="0" w:color="596B3B"/>
+              <w:insideH w:val="single" w:sz="4" w:space="0" w:color="596B3B"/>
+              <w:insideV w:val="single" w:sz="4" w:space="0" w:color="596B3B"/>
+            </w:tcBorders>
           </w:tcPr>
           <w:p>
             <w:pPr>
+              <w:spacing w:before="40" w:after="40"/>
               <w:jc w:val="center"/>
             </w:pPr>
             <w:r>
@@ -69,6 +86,7 @@
                 <w:i w:val="0"/>
                 <w:color w:val="FFFFFF"/>
                 <w:sz w:val="18"/>
+                <w:u w:val="none"/>
               </w:rPr>
               <w:t>User</w:t>
               <w:br/>
@@ -80,11 +98,20 @@
         </w:tc>
         <w:tc>
           <w:tcPr>
-            <w:tcW w:type="dxa" w:w="6803"/>
-            <w:shd w:val="clear" w:color="auto" w:fill="70AD47"/>
+            <w:tcW w:type="dxa" w:w="6520"/>
+            <w:shd w:val="clear" w:color="auto" w:fill="7F9443"/>
+            <w:tcBorders>
+              <w:top w:val="single" w:sz="4" w:space="0" w:color="596B3B"/>
+              <w:left w:val="single" w:sz="4" w:space="0" w:color="596B3B"/>
+              <w:bottom w:val="single" w:sz="4" w:space="0" w:color="596B3B"/>
+              <w:right w:val="single" w:sz="4" w:space="0" w:color="596B3B"/>
+              <w:insideH w:val="single" w:sz="4" w:space="0" w:color="596B3B"/>
+              <w:insideV w:val="single" w:sz="4" w:space="0" w:color="596B3B"/>
+            </w:tcBorders>
           </w:tcPr>
           <w:p>
             <w:pPr>
+              <w:spacing w:before="40" w:after="40"/>
               <w:jc w:val="both"/>
             </w:pPr>
             <w:r>
@@ -93,6 +120,7 @@
                 <w:i w:val="0"/>
                 <w:color w:val="FFFFFF"/>
                 <w:sz w:val="18"/>
+                <w:u w:val="none"/>
               </w:rPr>
               <w:t xml:space="preserve">User Story: </w:t>
             </w:r>
@@ -102,6 +130,7 @@
                 <w:i w:val="0"/>
                 <w:color w:val="FFFFFF"/>
                 <w:sz w:val="18"/>
+                <w:u w:val="none"/>
               </w:rPr>
               <w:t>As a user, I want to securely log in to the system using my credentials so that I can access my assigned features and dashboard.</w:t>
             </w:r>
@@ -111,15 +140,28 @@
       <w:tr>
         <w:tc>
           <w:tcPr>
-            <w:tcW w:type="dxa" w:w="8787"/>
+            <w:tcW w:type="dxa" w:w="8674"/>
             <w:gridSpan w:val="2"/>
+            <w:tcBorders>
+              <w:top w:val="single" w:sz="4" w:space="0" w:color="596B3B"/>
+              <w:left w:val="single" w:sz="4" w:space="0" w:color="596B3B"/>
+              <w:bottom w:val="single" w:sz="4" w:space="0" w:color="596B3B"/>
+              <w:right w:val="single" w:sz="4" w:space="0" w:color="596B3B"/>
+              <w:insideH w:val="single" w:sz="4" w:space="0" w:color="596B3B"/>
+              <w:insideV w:val="single" w:sz="4" w:space="0" w:color="596B3B"/>
+            </w:tcBorders>
           </w:tcPr>
           <w:p>
+            <w:pPr>
+              <w:spacing w:before="40" w:after="20"/>
+              <w:ind w:left="113"/>
+            </w:pPr>
             <w:r>
               <w:rPr>
                 <w:b/>
                 <w:i w:val="0"/>
                 <w:sz w:val="18"/>
+                <w:u w:val="none"/>
               </w:rPr>
               <w:t>Tasks:</w:t>
             </w:r>
@@ -129,11 +171,20 @@
       <w:tr>
         <w:tc>
           <w:tcPr>
-            <w:tcW w:type="dxa" w:w="8787"/>
+            <w:tcW w:type="dxa" w:w="8674"/>
             <w:gridSpan w:val="2"/>
+            <w:tcBorders>
+              <w:top w:val="single" w:sz="4" w:space="0" w:color="596B3B"/>
+              <w:left w:val="single" w:sz="4" w:space="0" w:color="596B3B"/>
+              <w:bottom w:val="single" w:sz="4" w:space="0" w:color="596B3B"/>
+              <w:right w:val="single" w:sz="4" w:space="0" w:color="596B3B"/>
+              <w:insideH w:val="single" w:sz="4" w:space="0" w:color="596B3B"/>
+              <w:insideV w:val="single" w:sz="4" w:space="0" w:color="596B3B"/>
+            </w:tcBorders>
           </w:tcPr>
           <w:p>
             <w:pPr>
+              <w:spacing w:before="20" w:after="20"/>
               <w:ind w:left="283"/>
             </w:pPr>
             <w:r>
@@ -141,6 +192,7 @@
                 <w:b w:val="0"/>
                 <w:i w:val="0"/>
                 <w:sz w:val="18"/>
+                <w:u w:val="none"/>
               </w:rPr>
               <w:t>• User can enter an email and a password in the login form.</w:t>
             </w:r>
@@ -150,11 +202,20 @@
       <w:tr>
         <w:tc>
           <w:tcPr>
-            <w:tcW w:type="dxa" w:w="8787"/>
+            <w:tcW w:type="dxa" w:w="8674"/>
             <w:gridSpan w:val="2"/>
+            <w:tcBorders>
+              <w:top w:val="single" w:sz="4" w:space="0" w:color="596B3B"/>
+              <w:left w:val="single" w:sz="4" w:space="0" w:color="596B3B"/>
+              <w:bottom w:val="single" w:sz="4" w:space="0" w:color="596B3B"/>
+              <w:right w:val="single" w:sz="4" w:space="0" w:color="596B3B"/>
+              <w:insideH w:val="single" w:sz="4" w:space="0" w:color="596B3B"/>
+              <w:insideV w:val="single" w:sz="4" w:space="0" w:color="596B3B"/>
+            </w:tcBorders>
           </w:tcPr>
           <w:p>
             <w:pPr>
+              <w:spacing w:before="20" w:after="20"/>
               <w:ind w:left="283"/>
             </w:pPr>
             <w:r>
@@ -162,6 +223,7 @@
                 <w:b w:val="0"/>
                 <w:i w:val="0"/>
                 <w:sz w:val="18"/>
+                <w:u w:val="none"/>
               </w:rPr>
               <w:t>• Authentication is validated before access is granted.</w:t>
             </w:r>
@@ -171,11 +233,20 @@
       <w:tr>
         <w:tc>
           <w:tcPr>
-            <w:tcW w:type="dxa" w:w="8787"/>
+            <w:tcW w:type="dxa" w:w="8674"/>
             <w:gridSpan w:val="2"/>
+            <w:tcBorders>
+              <w:top w:val="single" w:sz="4" w:space="0" w:color="596B3B"/>
+              <w:left w:val="single" w:sz="4" w:space="0" w:color="596B3B"/>
+              <w:bottom w:val="single" w:sz="4" w:space="0" w:color="596B3B"/>
+              <w:right w:val="single" w:sz="4" w:space="0" w:color="596B3B"/>
+              <w:insideH w:val="single" w:sz="4" w:space="0" w:color="596B3B"/>
+              <w:insideV w:val="single" w:sz="4" w:space="0" w:color="596B3B"/>
+            </w:tcBorders>
           </w:tcPr>
           <w:p>
             <w:pPr>
+              <w:spacing w:before="20" w:after="20"/>
               <w:ind w:left="283"/>
             </w:pPr>
             <w:r>
@@ -183,8 +254,9 @@
                 <w:b w:val="0"/>
                 <w:i w:val="0"/>
                 <w:sz w:val="18"/>
+                <w:u w:val="none"/>
               </w:rPr>
-              <w:t>• Users can reset their password if forgotten via email link (OTP flow).</w:t>
+              <w:t>• Users can reset their password if forgotten via OTP/email link.</w:t>
             </w:r>
           </w:p>
         </w:tc>
@@ -192,11 +264,20 @@
       <w:tr>
         <w:tc>
           <w:tcPr>
-            <w:tcW w:type="dxa" w:w="8787"/>
+            <w:tcW w:type="dxa" w:w="8674"/>
             <w:gridSpan w:val="2"/>
+            <w:tcBorders>
+              <w:top w:val="single" w:sz="4" w:space="0" w:color="596B3B"/>
+              <w:left w:val="single" w:sz="4" w:space="0" w:color="596B3B"/>
+              <w:bottom w:val="single" w:sz="4" w:space="0" w:color="596B3B"/>
+              <w:right w:val="single" w:sz="4" w:space="0" w:color="596B3B"/>
+              <w:insideH w:val="single" w:sz="4" w:space="0" w:color="596B3B"/>
+              <w:insideV w:val="single" w:sz="4" w:space="0" w:color="596B3B"/>
+            </w:tcBorders>
           </w:tcPr>
           <w:p>
             <w:pPr>
+              <w:spacing w:before="20" w:after="20"/>
               <w:ind w:left="283"/>
             </w:pPr>
             <w:r>
@@ -204,6 +285,7 @@
                 <w:b w:val="0"/>
                 <w:i w:val="0"/>
                 <w:sz w:val="18"/>
+                <w:u w:val="none"/>
               </w:rPr>
               <w:t>• Role-based redirection after login (Admin, Nurse, Student).</w:t>
             </w:r>
@@ -213,11 +295,20 @@
       <w:tr>
         <w:tc>
           <w:tcPr>
-            <w:tcW w:type="dxa" w:w="8787"/>
+            <w:tcW w:type="dxa" w:w="8674"/>
             <w:gridSpan w:val="2"/>
+            <w:tcBorders>
+              <w:top w:val="single" w:sz="4" w:space="0" w:color="596B3B"/>
+              <w:left w:val="single" w:sz="4" w:space="0" w:color="596B3B"/>
+              <w:bottom w:val="single" w:sz="4" w:space="0" w:color="596B3B"/>
+              <w:right w:val="single" w:sz="4" w:space="0" w:color="596B3B"/>
+              <w:insideH w:val="single" w:sz="4" w:space="0" w:color="596B3B"/>
+              <w:insideV w:val="single" w:sz="4" w:space="0" w:color="596B3B"/>
+            </w:tcBorders>
           </w:tcPr>
           <w:p>
             <w:pPr>
+              <w:spacing w:before="20" w:after="20"/>
               <w:ind w:left="283"/>
             </w:pPr>
             <w:r>
@@ -225,6 +316,7 @@
                 <w:b w:val="0"/>
                 <w:i w:val="0"/>
                 <w:sz w:val="18"/>
+                <w:u w:val="none"/>
               </w:rPr>
               <w:t>• Admin verification flow: approve or reject new staff accounts.</w:t>
             </w:r>
@@ -234,11 +326,20 @@
       <w:tr>
         <w:tc>
           <w:tcPr>
-            <w:tcW w:type="dxa" w:w="1984"/>
-            <w:shd w:val="clear" w:color="auto" w:fill="70AD47"/>
+            <w:tcW w:type="dxa" w:w="2154"/>
+            <w:shd w:val="clear" w:color="auto" w:fill="7F9443"/>
+            <w:tcBorders>
+              <w:top w:val="single" w:sz="4" w:space="0" w:color="596B3B"/>
+              <w:left w:val="single" w:sz="4" w:space="0" w:color="596B3B"/>
+              <w:bottom w:val="single" w:sz="4" w:space="0" w:color="596B3B"/>
+              <w:right w:val="single" w:sz="4" w:space="0" w:color="596B3B"/>
+              <w:insideH w:val="single" w:sz="4" w:space="0" w:color="596B3B"/>
+              <w:insideV w:val="single" w:sz="4" w:space="0" w:color="596B3B"/>
+            </w:tcBorders>
           </w:tcPr>
           <w:p>
             <w:pPr>
+              <w:spacing w:before="40" w:after="40"/>
               <w:jc w:val="center"/>
             </w:pPr>
             <w:r>
@@ -247,6 +348,7 @@
                 <w:i w:val="0"/>
                 <w:color w:val="FFFFFF"/>
                 <w:sz w:val="18"/>
+                <w:u w:val="none"/>
               </w:rPr>
               <w:t>Roles &amp;</w:t>
               <w:br/>
@@ -256,11 +358,20 @@
         </w:tc>
         <w:tc>
           <w:tcPr>
-            <w:tcW w:type="dxa" w:w="6803"/>
-            <w:shd w:val="clear" w:color="auto" w:fill="70AD47"/>
+            <w:tcW w:type="dxa" w:w="6520"/>
+            <w:shd w:val="clear" w:color="auto" w:fill="7F9443"/>
+            <w:tcBorders>
+              <w:top w:val="single" w:sz="4" w:space="0" w:color="596B3B"/>
+              <w:left w:val="single" w:sz="4" w:space="0" w:color="596B3B"/>
+              <w:bottom w:val="single" w:sz="4" w:space="0" w:color="596B3B"/>
+              <w:right w:val="single" w:sz="4" w:space="0" w:color="596B3B"/>
+              <w:insideH w:val="single" w:sz="4" w:space="0" w:color="596B3B"/>
+              <w:insideV w:val="single" w:sz="4" w:space="0" w:color="596B3B"/>
+            </w:tcBorders>
           </w:tcPr>
           <w:p>
             <w:pPr>
+              <w:spacing w:before="40" w:after="40"/>
               <w:jc w:val="both"/>
             </w:pPr>
             <w:r>
@@ -269,6 +380,7 @@
                 <w:i w:val="0"/>
                 <w:color w:val="FFFFFF"/>
                 <w:sz w:val="18"/>
+                <w:u w:val="none"/>
               </w:rPr>
               <w:t xml:space="preserve">User Story: </w:t>
             </w:r>
@@ -278,6 +390,7 @@
                 <w:i w:val="0"/>
                 <w:color w:val="FFFFFF"/>
                 <w:sz w:val="18"/>
+                <w:u w:val="none"/>
               </w:rPr>
               <w:t>As the system administrator, I want to define roles and permissions for users so that I can control access to different features based on user roles.</w:t>
             </w:r>
@@ -287,15 +400,28 @@
       <w:tr>
         <w:tc>
           <w:tcPr>
-            <w:tcW w:type="dxa" w:w="8787"/>
+            <w:tcW w:type="dxa" w:w="8674"/>
             <w:gridSpan w:val="2"/>
+            <w:tcBorders>
+              <w:top w:val="single" w:sz="4" w:space="0" w:color="596B3B"/>
+              <w:left w:val="single" w:sz="4" w:space="0" w:color="596B3B"/>
+              <w:bottom w:val="single" w:sz="4" w:space="0" w:color="596B3B"/>
+              <w:right w:val="single" w:sz="4" w:space="0" w:color="596B3B"/>
+              <w:insideH w:val="single" w:sz="4" w:space="0" w:color="596B3B"/>
+              <w:insideV w:val="single" w:sz="4" w:space="0" w:color="596B3B"/>
+            </w:tcBorders>
           </w:tcPr>
           <w:p>
+            <w:pPr>
+              <w:spacing w:before="40" w:after="20"/>
+              <w:ind w:left="113"/>
+            </w:pPr>
             <w:r>
               <w:rPr>
                 <w:b/>
                 <w:i w:val="0"/>
                 <w:sz w:val="18"/>
+                <w:u w:val="none"/>
               </w:rPr>
               <w:t>Tasks:</w:t>
             </w:r>
@@ -305,11 +431,20 @@
       <w:tr>
         <w:tc>
           <w:tcPr>
-            <w:tcW w:type="dxa" w:w="8787"/>
+            <w:tcW w:type="dxa" w:w="8674"/>
             <w:gridSpan w:val="2"/>
+            <w:tcBorders>
+              <w:top w:val="single" w:sz="4" w:space="0" w:color="596B3B"/>
+              <w:left w:val="single" w:sz="4" w:space="0" w:color="596B3B"/>
+              <w:bottom w:val="single" w:sz="4" w:space="0" w:color="596B3B"/>
+              <w:right w:val="single" w:sz="4" w:space="0" w:color="596B3B"/>
+              <w:insideH w:val="single" w:sz="4" w:space="0" w:color="596B3B"/>
+              <w:insideV w:val="single" w:sz="4" w:space="0" w:color="596B3B"/>
+            </w:tcBorders>
           </w:tcPr>
           <w:p>
             <w:pPr>
+              <w:spacing w:before="20" w:after="20"/>
               <w:ind w:left="283"/>
             </w:pPr>
             <w:r>
@@ -317,6 +452,7 @@
                 <w:b w:val="0"/>
                 <w:i w:val="0"/>
                 <w:sz w:val="18"/>
+                <w:u w:val="none"/>
               </w:rPr>
               <w:t>• Role-based access control is enforced (Admin, Nurse, Student).</w:t>
             </w:r>
@@ -326,11 +462,20 @@
       <w:tr>
         <w:tc>
           <w:tcPr>
-            <w:tcW w:type="dxa" w:w="8787"/>
+            <w:tcW w:type="dxa" w:w="8674"/>
             <w:gridSpan w:val="2"/>
+            <w:tcBorders>
+              <w:top w:val="single" w:sz="4" w:space="0" w:color="596B3B"/>
+              <w:left w:val="single" w:sz="4" w:space="0" w:color="596B3B"/>
+              <w:bottom w:val="single" w:sz="4" w:space="0" w:color="596B3B"/>
+              <w:right w:val="single" w:sz="4" w:space="0" w:color="596B3B"/>
+              <w:insideH w:val="single" w:sz="4" w:space="0" w:color="596B3B"/>
+              <w:insideV w:val="single" w:sz="4" w:space="0" w:color="596B3B"/>
+            </w:tcBorders>
           </w:tcPr>
           <w:p>
             <w:pPr>
+              <w:spacing w:before="20" w:after="20"/>
               <w:ind w:left="283"/>
             </w:pPr>
             <w:r>
@@ -338,8 +483,9 @@
                 <w:b w:val="0"/>
                 <w:i w:val="0"/>
                 <w:sz w:val="18"/>
+                <w:u w:val="none"/>
               </w:rPr>
-              <w:t>• Admin can approve or reject user registrations via User Management.</w:t>
+              <w:t>• Admin can approve or reject staff registrations via User Management.</w:t>
             </w:r>
           </w:p>
         </w:tc>
@@ -347,11 +493,20 @@
       <w:tr>
         <w:tc>
           <w:tcPr>
-            <w:tcW w:type="dxa" w:w="8787"/>
+            <w:tcW w:type="dxa" w:w="8674"/>
             <w:gridSpan w:val="2"/>
+            <w:tcBorders>
+              <w:top w:val="single" w:sz="4" w:space="0" w:color="596B3B"/>
+              <w:left w:val="single" w:sz="4" w:space="0" w:color="596B3B"/>
+              <w:bottom w:val="single" w:sz="4" w:space="0" w:color="596B3B"/>
+              <w:right w:val="single" w:sz="4" w:space="0" w:color="596B3B"/>
+              <w:insideH w:val="single" w:sz="4" w:space="0" w:color="596B3B"/>
+              <w:insideV w:val="single" w:sz="4" w:space="0" w:color="596B3B"/>
+            </w:tcBorders>
           </w:tcPr>
           <w:p>
             <w:pPr>
+              <w:spacing w:before="20" w:after="20"/>
               <w:ind w:left="283"/>
             </w:pPr>
             <w:r>
@@ -359,6 +514,7 @@
                 <w:b w:val="0"/>
                 <w:i w:val="0"/>
                 <w:sz w:val="18"/>
+                <w:u w:val="none"/>
               </w:rPr>
               <w:t>• Admin can manage user accounts (view, approve, reject, remove).</w:t>
             </w:r>
@@ -368,11 +524,20 @@
       <w:tr>
         <w:tc>
           <w:tcPr>
-            <w:tcW w:type="dxa" w:w="1984"/>
-            <w:shd w:val="clear" w:color="auto" w:fill="70AD47"/>
+            <w:tcW w:type="dxa" w:w="2154"/>
+            <w:shd w:val="clear" w:color="auto" w:fill="7F9443"/>
+            <w:tcBorders>
+              <w:top w:val="single" w:sz="4" w:space="0" w:color="596B3B"/>
+              <w:left w:val="single" w:sz="4" w:space="0" w:color="596B3B"/>
+              <w:bottom w:val="single" w:sz="4" w:space="0" w:color="596B3B"/>
+              <w:right w:val="single" w:sz="4" w:space="0" w:color="596B3B"/>
+              <w:insideH w:val="single" w:sz="4" w:space="0" w:color="596B3B"/>
+              <w:insideV w:val="single" w:sz="4" w:space="0" w:color="596B3B"/>
+            </w:tcBorders>
           </w:tcPr>
           <w:p>
             <w:pPr>
+              <w:spacing w:before="40" w:after="40"/>
               <w:jc w:val="center"/>
             </w:pPr>
             <w:r>
@@ -381,20 +546,32 @@
                 <w:i w:val="0"/>
                 <w:color w:val="FFFFFF"/>
                 <w:sz w:val="18"/>
+                <w:u w:val="none"/>
               </w:rPr>
               <w:t>Appointment</w:t>
               <w:br/>
               <w:t>Booking</w:t>
+              <w:br/>
+              <w:t>(Student)</w:t>
             </w:r>
           </w:p>
         </w:tc>
         <w:tc>
           <w:tcPr>
-            <w:tcW w:type="dxa" w:w="6803"/>
-            <w:shd w:val="clear" w:color="auto" w:fill="70AD47"/>
+            <w:tcW w:type="dxa" w:w="6520"/>
+            <w:shd w:val="clear" w:color="auto" w:fill="7F9443"/>
+            <w:tcBorders>
+              <w:top w:val="single" w:sz="4" w:space="0" w:color="596B3B"/>
+              <w:left w:val="single" w:sz="4" w:space="0" w:color="596B3B"/>
+              <w:bottom w:val="single" w:sz="4" w:space="0" w:color="596B3B"/>
+              <w:right w:val="single" w:sz="4" w:space="0" w:color="596B3B"/>
+              <w:insideH w:val="single" w:sz="4" w:space="0" w:color="596B3B"/>
+              <w:insideV w:val="single" w:sz="4" w:space="0" w:color="596B3B"/>
+            </w:tcBorders>
           </w:tcPr>
           <w:p>
             <w:pPr>
+              <w:spacing w:before="40" w:after="40"/>
               <w:jc w:val="both"/>
             </w:pPr>
             <w:r>
@@ -403,6 +580,7 @@
                 <w:i w:val="0"/>
                 <w:color w:val="FFFFFF"/>
                 <w:sz w:val="18"/>
+                <w:u w:val="none"/>
               </w:rPr>
               <w:t xml:space="preserve">User Story: </w:t>
             </w:r>
@@ -412,6 +590,7 @@
                 <w:i w:val="0"/>
                 <w:color w:val="FFFFFF"/>
                 <w:sz w:val="18"/>
+                <w:u w:val="none"/>
               </w:rPr>
               <w:t>As a student, I want to book, view, and cancel appointments so that I can request clinic support easily.</w:t>
             </w:r>
@@ -421,15 +600,28 @@
       <w:tr>
         <w:tc>
           <w:tcPr>
-            <w:tcW w:type="dxa" w:w="8787"/>
+            <w:tcW w:type="dxa" w:w="8674"/>
             <w:gridSpan w:val="2"/>
+            <w:tcBorders>
+              <w:top w:val="single" w:sz="4" w:space="0" w:color="596B3B"/>
+              <w:left w:val="single" w:sz="4" w:space="0" w:color="596B3B"/>
+              <w:bottom w:val="single" w:sz="4" w:space="0" w:color="596B3B"/>
+              <w:right w:val="single" w:sz="4" w:space="0" w:color="596B3B"/>
+              <w:insideH w:val="single" w:sz="4" w:space="0" w:color="596B3B"/>
+              <w:insideV w:val="single" w:sz="4" w:space="0" w:color="596B3B"/>
+            </w:tcBorders>
           </w:tcPr>
           <w:p>
+            <w:pPr>
+              <w:spacing w:before="40" w:after="20"/>
+              <w:ind w:left="113"/>
+            </w:pPr>
             <w:r>
               <w:rPr>
                 <w:b/>
                 <w:i w:val="0"/>
                 <w:sz w:val="18"/>
+                <w:u w:val="none"/>
               </w:rPr>
               <w:t>Tasks:</w:t>
             </w:r>
@@ -439,11 +631,20 @@
       <w:tr>
         <w:tc>
           <w:tcPr>
-            <w:tcW w:type="dxa" w:w="8787"/>
+            <w:tcW w:type="dxa" w:w="8674"/>
             <w:gridSpan w:val="2"/>
+            <w:tcBorders>
+              <w:top w:val="single" w:sz="4" w:space="0" w:color="596B3B"/>
+              <w:left w:val="single" w:sz="4" w:space="0" w:color="596B3B"/>
+              <w:bottom w:val="single" w:sz="4" w:space="0" w:color="596B3B"/>
+              <w:right w:val="single" w:sz="4" w:space="0" w:color="596B3B"/>
+              <w:insideH w:val="single" w:sz="4" w:space="0" w:color="596B3B"/>
+              <w:insideV w:val="single" w:sz="4" w:space="0" w:color="596B3B"/>
+            </w:tcBorders>
           </w:tcPr>
           <w:p>
             <w:pPr>
+              <w:spacing w:before="20" w:after="20"/>
               <w:ind w:left="283"/>
             </w:pPr>
             <w:r>
@@ -451,6 +652,7 @@
                 <w:b w:val="0"/>
                 <w:i w:val="0"/>
                 <w:sz w:val="18"/>
+                <w:u w:val="none"/>
               </w:rPr>
               <w:t>• Students can book a new appointment from their dashboard.</w:t>
             </w:r>
@@ -460,11 +662,20 @@
       <w:tr>
         <w:tc>
           <w:tcPr>
-            <w:tcW w:type="dxa" w:w="8787"/>
+            <w:tcW w:type="dxa" w:w="8674"/>
             <w:gridSpan w:val="2"/>
+            <w:tcBorders>
+              <w:top w:val="single" w:sz="4" w:space="0" w:color="596B3B"/>
+              <w:left w:val="single" w:sz="4" w:space="0" w:color="596B3B"/>
+              <w:bottom w:val="single" w:sz="4" w:space="0" w:color="596B3B"/>
+              <w:right w:val="single" w:sz="4" w:space="0" w:color="596B3B"/>
+              <w:insideH w:val="single" w:sz="4" w:space="0" w:color="596B3B"/>
+              <w:insideV w:val="single" w:sz="4" w:space="0" w:color="596B3B"/>
+            </w:tcBorders>
           </w:tcPr>
           <w:p>
             <w:pPr>
+              <w:spacing w:before="20" w:after="20"/>
               <w:ind w:left="283"/>
             </w:pPr>
             <w:r>
@@ -472,8 +683,9 @@
                 <w:b w:val="0"/>
                 <w:i w:val="0"/>
                 <w:sz w:val="18"/>
+                <w:u w:val="none"/>
               </w:rPr>
-              <w:t>• Students can view their appointment history and current status.</w:t>
+              <w:t>• Students can view their current and past appointments.</w:t>
             </w:r>
           </w:p>
         </w:tc>
@@ -481,11 +693,20 @@
       <w:tr>
         <w:tc>
           <w:tcPr>
-            <w:tcW w:type="dxa" w:w="8787"/>
+            <w:tcW w:type="dxa" w:w="8674"/>
             <w:gridSpan w:val="2"/>
+            <w:tcBorders>
+              <w:top w:val="single" w:sz="4" w:space="0" w:color="596B3B"/>
+              <w:left w:val="single" w:sz="4" w:space="0" w:color="596B3B"/>
+              <w:bottom w:val="single" w:sz="4" w:space="0" w:color="596B3B"/>
+              <w:right w:val="single" w:sz="4" w:space="0" w:color="596B3B"/>
+              <w:insideH w:val="single" w:sz="4" w:space="0" w:color="596B3B"/>
+              <w:insideV w:val="single" w:sz="4" w:space="0" w:color="596B3B"/>
+            </w:tcBorders>
           </w:tcPr>
           <w:p>
             <w:pPr>
+              <w:spacing w:before="20" w:after="20"/>
               <w:ind w:left="283"/>
             </w:pPr>
             <w:r>
@@ -493,6 +714,7 @@
                 <w:b w:val="0"/>
                 <w:i w:val="0"/>
                 <w:sz w:val="18"/>
+                <w:u w:val="none"/>
               </w:rPr>
               <w:t>• Students can cancel a pending appointment.</w:t>
             </w:r>
@@ -502,11 +724,20 @@
       <w:tr>
         <w:tc>
           <w:tcPr>
-            <w:tcW w:type="dxa" w:w="1984"/>
-            <w:shd w:val="clear" w:color="auto" w:fill="70AD47"/>
+            <w:tcW w:type="dxa" w:w="2154"/>
+            <w:shd w:val="clear" w:color="auto" w:fill="7F9443"/>
+            <w:tcBorders>
+              <w:top w:val="single" w:sz="4" w:space="0" w:color="596B3B"/>
+              <w:left w:val="single" w:sz="4" w:space="0" w:color="596B3B"/>
+              <w:bottom w:val="single" w:sz="4" w:space="0" w:color="596B3B"/>
+              <w:right w:val="single" w:sz="4" w:space="0" w:color="596B3B"/>
+              <w:insideH w:val="single" w:sz="4" w:space="0" w:color="596B3B"/>
+              <w:insideV w:val="single" w:sz="4" w:space="0" w:color="596B3B"/>
+            </w:tcBorders>
           </w:tcPr>
           <w:p>
             <w:pPr>
+              <w:spacing w:before="40" w:after="40"/>
               <w:jc w:val="center"/>
             </w:pPr>
             <w:r>
@@ -515,6 +746,7 @@
                 <w:i w:val="0"/>
                 <w:color w:val="FFFFFF"/>
                 <w:sz w:val="18"/>
+                <w:u w:val="none"/>
               </w:rPr>
               <w:t>Appointment</w:t>
               <w:br/>
@@ -526,11 +758,20 @@
         </w:tc>
         <w:tc>
           <w:tcPr>
-            <w:tcW w:type="dxa" w:w="6803"/>
-            <w:shd w:val="clear" w:color="auto" w:fill="70AD47"/>
+            <w:tcW w:type="dxa" w:w="6520"/>
+            <w:shd w:val="clear" w:color="auto" w:fill="7F9443"/>
+            <w:tcBorders>
+              <w:top w:val="single" w:sz="4" w:space="0" w:color="596B3B"/>
+              <w:left w:val="single" w:sz="4" w:space="0" w:color="596B3B"/>
+              <w:bottom w:val="single" w:sz="4" w:space="0" w:color="596B3B"/>
+              <w:right w:val="single" w:sz="4" w:space="0" w:color="596B3B"/>
+              <w:insideH w:val="single" w:sz="4" w:space="0" w:color="596B3B"/>
+              <w:insideV w:val="single" w:sz="4" w:space="0" w:color="596B3B"/>
+            </w:tcBorders>
           </w:tcPr>
           <w:p>
             <w:pPr>
+              <w:spacing w:before="40" w:after="40"/>
               <w:jc w:val="both"/>
             </w:pPr>
             <w:r>
@@ -539,6 +780,7 @@
                 <w:i w:val="0"/>
                 <w:color w:val="FFFFFF"/>
                 <w:sz w:val="18"/>
+                <w:u w:val="none"/>
               </w:rPr>
               <w:t xml:space="preserve">User Story: </w:t>
             </w:r>
@@ -548,6 +790,7 @@
                 <w:i w:val="0"/>
                 <w:color w:val="FFFFFF"/>
                 <w:sz w:val="18"/>
+                <w:u w:val="none"/>
               </w:rPr>
               <w:t>As a nurse, I want to manage the appointment queue so that I can ensure proper patient flow and accurate session tracking.</w:t>
             </w:r>
@@ -557,15 +800,28 @@
       <w:tr>
         <w:tc>
           <w:tcPr>
-            <w:tcW w:type="dxa" w:w="8787"/>
+            <w:tcW w:type="dxa" w:w="8674"/>
             <w:gridSpan w:val="2"/>
+            <w:tcBorders>
+              <w:top w:val="single" w:sz="4" w:space="0" w:color="596B3B"/>
+              <w:left w:val="single" w:sz="4" w:space="0" w:color="596B3B"/>
+              <w:bottom w:val="single" w:sz="4" w:space="0" w:color="596B3B"/>
+              <w:right w:val="single" w:sz="4" w:space="0" w:color="596B3B"/>
+              <w:insideH w:val="single" w:sz="4" w:space="0" w:color="596B3B"/>
+              <w:insideV w:val="single" w:sz="4" w:space="0" w:color="596B3B"/>
+            </w:tcBorders>
           </w:tcPr>
           <w:p>
+            <w:pPr>
+              <w:spacing w:before="40" w:after="20"/>
+              <w:ind w:left="113"/>
+            </w:pPr>
             <w:r>
               <w:rPr>
                 <w:b/>
                 <w:i w:val="0"/>
                 <w:sz w:val="18"/>
+                <w:u w:val="none"/>
               </w:rPr>
               <w:t>Tasks:</w:t>
             </w:r>
@@ -575,11 +831,20 @@
       <w:tr>
         <w:tc>
           <w:tcPr>
-            <w:tcW w:type="dxa" w:w="8787"/>
+            <w:tcW w:type="dxa" w:w="8674"/>
             <w:gridSpan w:val="2"/>
+            <w:tcBorders>
+              <w:top w:val="single" w:sz="4" w:space="0" w:color="596B3B"/>
+              <w:left w:val="single" w:sz="4" w:space="0" w:color="596B3B"/>
+              <w:bottom w:val="single" w:sz="4" w:space="0" w:color="596B3B"/>
+              <w:right w:val="single" w:sz="4" w:space="0" w:color="596B3B"/>
+              <w:insideH w:val="single" w:sz="4" w:space="0" w:color="596B3B"/>
+              <w:insideV w:val="single" w:sz="4" w:space="0" w:color="596B3B"/>
+            </w:tcBorders>
           </w:tcPr>
           <w:p>
             <w:pPr>
+              <w:spacing w:before="20" w:after="20"/>
               <w:ind w:left="283"/>
             </w:pPr>
             <w:r>
@@ -587,6 +852,7 @@
                 <w:b w:val="0"/>
                 <w:i w:val="0"/>
                 <w:sz w:val="18"/>
+                <w:u w:val="none"/>
               </w:rPr>
               <w:t>• Nurse can start an appointment session.</w:t>
             </w:r>
@@ -596,11 +862,20 @@
       <w:tr>
         <w:tc>
           <w:tcPr>
-            <w:tcW w:type="dxa" w:w="8787"/>
+            <w:tcW w:type="dxa" w:w="8674"/>
             <w:gridSpan w:val="2"/>
+            <w:tcBorders>
+              <w:top w:val="single" w:sz="4" w:space="0" w:color="596B3B"/>
+              <w:left w:val="single" w:sz="4" w:space="0" w:color="596B3B"/>
+              <w:bottom w:val="single" w:sz="4" w:space="0" w:color="596B3B"/>
+              <w:right w:val="single" w:sz="4" w:space="0" w:color="596B3B"/>
+              <w:insideH w:val="single" w:sz="4" w:space="0" w:color="596B3B"/>
+              <w:insideV w:val="single" w:sz="4" w:space="0" w:color="596B3B"/>
+            </w:tcBorders>
           </w:tcPr>
           <w:p>
             <w:pPr>
+              <w:spacing w:before="20" w:after="20"/>
               <w:ind w:left="283"/>
             </w:pPr>
             <w:r>
@@ -608,6 +883,7 @@
                 <w:b w:val="0"/>
                 <w:i w:val="0"/>
                 <w:sz w:val="18"/>
+                <w:u w:val="none"/>
               </w:rPr>
               <w:t>• Nurse can complete a session upon finishing.</w:t>
             </w:r>
@@ -617,11 +893,20 @@
       <w:tr>
         <w:tc>
           <w:tcPr>
-            <w:tcW w:type="dxa" w:w="8787"/>
+            <w:tcW w:type="dxa" w:w="8674"/>
             <w:gridSpan w:val="2"/>
+            <w:tcBorders>
+              <w:top w:val="single" w:sz="4" w:space="0" w:color="596B3B"/>
+              <w:left w:val="single" w:sz="4" w:space="0" w:color="596B3B"/>
+              <w:bottom w:val="single" w:sz="4" w:space="0" w:color="596B3B"/>
+              <w:right w:val="single" w:sz="4" w:space="0" w:color="596B3B"/>
+              <w:insideH w:val="single" w:sz="4" w:space="0" w:color="596B3B"/>
+              <w:insideV w:val="single" w:sz="4" w:space="0" w:color="596B3B"/>
+            </w:tcBorders>
           </w:tcPr>
           <w:p>
             <w:pPr>
+              <w:spacing w:before="20" w:after="20"/>
               <w:ind w:left="283"/>
             </w:pPr>
             <w:r>
@@ -629,6 +914,7 @@
                 <w:b w:val="0"/>
                 <w:i w:val="0"/>
                 <w:sz w:val="18"/>
+                <w:u w:val="none"/>
               </w:rPr>
               <w:t>• Nurse can decline an appointment request.</w:t>
             </w:r>
@@ -638,11 +924,20 @@
       <w:tr>
         <w:tc>
           <w:tcPr>
-            <w:tcW w:type="dxa" w:w="8787"/>
+            <w:tcW w:type="dxa" w:w="8674"/>
             <w:gridSpan w:val="2"/>
+            <w:tcBorders>
+              <w:top w:val="single" w:sz="4" w:space="0" w:color="596B3B"/>
+              <w:left w:val="single" w:sz="4" w:space="0" w:color="596B3B"/>
+              <w:bottom w:val="single" w:sz="4" w:space="0" w:color="596B3B"/>
+              <w:right w:val="single" w:sz="4" w:space="0" w:color="596B3B"/>
+              <w:insideH w:val="single" w:sz="4" w:space="0" w:color="596B3B"/>
+              <w:insideV w:val="single" w:sz="4" w:space="0" w:color="596B3B"/>
+            </w:tcBorders>
           </w:tcPr>
           <w:p>
             <w:pPr>
+              <w:spacing w:before="20" w:after="20"/>
               <w:ind w:left="283"/>
             </w:pPr>
             <w:r>
@@ -650,6 +945,7 @@
                 <w:b w:val="0"/>
                 <w:i w:val="0"/>
                 <w:sz w:val="18"/>
+                <w:u w:val="none"/>
               </w:rPr>
               <w:t>• Appointment status transitions are reflected in real-time.</w:t>
             </w:r>
@@ -659,11 +955,20 @@
       <w:tr>
         <w:tc>
           <w:tcPr>
-            <w:tcW w:type="dxa" w:w="1984"/>
-            <w:shd w:val="clear" w:color="auto" w:fill="70AD47"/>
+            <w:tcW w:type="dxa" w:w="2154"/>
+            <w:shd w:val="clear" w:color="auto" w:fill="7F9443"/>
+            <w:tcBorders>
+              <w:top w:val="single" w:sz="4" w:space="0" w:color="596B3B"/>
+              <w:left w:val="single" w:sz="4" w:space="0" w:color="596B3B"/>
+              <w:bottom w:val="single" w:sz="4" w:space="0" w:color="596B3B"/>
+              <w:right w:val="single" w:sz="4" w:space="0" w:color="596B3B"/>
+              <w:insideH w:val="single" w:sz="4" w:space="0" w:color="596B3B"/>
+              <w:insideV w:val="single" w:sz="4" w:space="0" w:color="596B3B"/>
+            </w:tcBorders>
           </w:tcPr>
           <w:p>
             <w:pPr>
+              <w:spacing w:before="40" w:after="40"/>
               <w:jc w:val="center"/>
             </w:pPr>
             <w:r>
@@ -672,6 +977,7 @@
                 <w:i w:val="0"/>
                 <w:color w:val="FFFFFF"/>
                 <w:sz w:val="18"/>
+                <w:u w:val="none"/>
               </w:rPr>
               <w:t>Admin</w:t>
               <w:br/>
@@ -683,11 +989,20 @@
         </w:tc>
         <w:tc>
           <w:tcPr>
-            <w:tcW w:type="dxa" w:w="6803"/>
-            <w:shd w:val="clear" w:color="auto" w:fill="70AD47"/>
+            <w:tcW w:type="dxa" w:w="6520"/>
+            <w:shd w:val="clear" w:color="auto" w:fill="7F9443"/>
+            <w:tcBorders>
+              <w:top w:val="single" w:sz="4" w:space="0" w:color="596B3B"/>
+              <w:left w:val="single" w:sz="4" w:space="0" w:color="596B3B"/>
+              <w:bottom w:val="single" w:sz="4" w:space="0" w:color="596B3B"/>
+              <w:right w:val="single" w:sz="4" w:space="0" w:color="596B3B"/>
+              <w:insideH w:val="single" w:sz="4" w:space="0" w:color="596B3B"/>
+              <w:insideV w:val="single" w:sz="4" w:space="0" w:color="596B3B"/>
+            </w:tcBorders>
           </w:tcPr>
           <w:p>
             <w:pPr>
+              <w:spacing w:before="40" w:after="40"/>
               <w:jc w:val="both"/>
             </w:pPr>
             <w:r>
@@ -696,6 +1011,7 @@
                 <w:i w:val="0"/>
                 <w:color w:val="FFFFFF"/>
                 <w:sz w:val="18"/>
+                <w:u w:val="none"/>
               </w:rPr>
               <w:t xml:space="preserve">User Story: </w:t>
             </w:r>
@@ -705,6 +1021,7 @@
                 <w:i w:val="0"/>
                 <w:color w:val="FFFFFF"/>
                 <w:sz w:val="18"/>
+                <w:u w:val="none"/>
               </w:rPr>
               <w:t>As an admin, I want to view all, today's, and weekly appointments so that I can monitor clinic activity.</w:t>
             </w:r>
@@ -714,15 +1031,28 @@
       <w:tr>
         <w:tc>
           <w:tcPr>
-            <w:tcW w:type="dxa" w:w="8787"/>
+            <w:tcW w:type="dxa" w:w="8674"/>
             <w:gridSpan w:val="2"/>
+            <w:tcBorders>
+              <w:top w:val="single" w:sz="4" w:space="0" w:color="596B3B"/>
+              <w:left w:val="single" w:sz="4" w:space="0" w:color="596B3B"/>
+              <w:bottom w:val="single" w:sz="4" w:space="0" w:color="596B3B"/>
+              <w:right w:val="single" w:sz="4" w:space="0" w:color="596B3B"/>
+              <w:insideH w:val="single" w:sz="4" w:space="0" w:color="596B3B"/>
+              <w:insideV w:val="single" w:sz="4" w:space="0" w:color="596B3B"/>
+            </w:tcBorders>
           </w:tcPr>
           <w:p>
+            <w:pPr>
+              <w:spacing w:before="40" w:after="20"/>
+              <w:ind w:left="113"/>
+            </w:pPr>
             <w:r>
               <w:rPr>
                 <w:b/>
                 <w:i w:val="0"/>
                 <w:sz w:val="18"/>
+                <w:u w:val="none"/>
               </w:rPr>
               <w:t>Tasks:</w:t>
             </w:r>
@@ -732,11 +1062,20 @@
       <w:tr>
         <w:tc>
           <w:tcPr>
-            <w:tcW w:type="dxa" w:w="8787"/>
+            <w:tcW w:type="dxa" w:w="8674"/>
             <w:gridSpan w:val="2"/>
+            <w:tcBorders>
+              <w:top w:val="single" w:sz="4" w:space="0" w:color="596B3B"/>
+              <w:left w:val="single" w:sz="4" w:space="0" w:color="596B3B"/>
+              <w:bottom w:val="single" w:sz="4" w:space="0" w:color="596B3B"/>
+              <w:right w:val="single" w:sz="4" w:space="0" w:color="596B3B"/>
+              <w:insideH w:val="single" w:sz="4" w:space="0" w:color="596B3B"/>
+              <w:insideV w:val="single" w:sz="4" w:space="0" w:color="596B3B"/>
+            </w:tcBorders>
           </w:tcPr>
           <w:p>
             <w:pPr>
+              <w:spacing w:before="20" w:after="20"/>
               <w:ind w:left="283"/>
             </w:pPr>
             <w:r>
@@ -744,6 +1083,7 @@
                 <w:b w:val="0"/>
                 <w:i w:val="0"/>
                 <w:sz w:val="18"/>
+                <w:u w:val="none"/>
               </w:rPr>
               <w:t>• Admin can view all appointments across the system.</w:t>
             </w:r>
@@ -753,11 +1093,20 @@
       <w:tr>
         <w:tc>
           <w:tcPr>
-            <w:tcW w:type="dxa" w:w="8787"/>
+            <w:tcW w:type="dxa" w:w="8674"/>
             <w:gridSpan w:val="2"/>
+            <w:tcBorders>
+              <w:top w:val="single" w:sz="4" w:space="0" w:color="596B3B"/>
+              <w:left w:val="single" w:sz="4" w:space="0" w:color="596B3B"/>
+              <w:bottom w:val="single" w:sz="4" w:space="0" w:color="596B3B"/>
+              <w:right w:val="single" w:sz="4" w:space="0" w:color="596B3B"/>
+              <w:insideH w:val="single" w:sz="4" w:space="0" w:color="596B3B"/>
+              <w:insideV w:val="single" w:sz="4" w:space="0" w:color="596B3B"/>
+            </w:tcBorders>
           </w:tcPr>
           <w:p>
             <w:pPr>
+              <w:spacing w:before="20" w:after="20"/>
               <w:ind w:left="283"/>
             </w:pPr>
             <w:r>
@@ -765,6 +1114,7 @@
                 <w:b w:val="0"/>
                 <w:i w:val="0"/>
                 <w:sz w:val="18"/>
+                <w:u w:val="none"/>
               </w:rPr>
               <w:t>• Admin can filter appointments by today's date.</w:t>
             </w:r>
@@ -774,11 +1124,20 @@
       <w:tr>
         <w:tc>
           <w:tcPr>
-            <w:tcW w:type="dxa" w:w="8787"/>
+            <w:tcW w:type="dxa" w:w="8674"/>
             <w:gridSpan w:val="2"/>
+            <w:tcBorders>
+              <w:top w:val="single" w:sz="4" w:space="0" w:color="596B3B"/>
+              <w:left w:val="single" w:sz="4" w:space="0" w:color="596B3B"/>
+              <w:bottom w:val="single" w:sz="4" w:space="0" w:color="596B3B"/>
+              <w:right w:val="single" w:sz="4" w:space="0" w:color="596B3B"/>
+              <w:insideH w:val="single" w:sz="4" w:space="0" w:color="596B3B"/>
+              <w:insideV w:val="single" w:sz="4" w:space="0" w:color="596B3B"/>
+            </w:tcBorders>
           </w:tcPr>
           <w:p>
             <w:pPr>
+              <w:spacing w:before="20" w:after="20"/>
               <w:ind w:left="283"/>
             </w:pPr>
             <w:r>
@@ -786,8 +1145,9 @@
                 <w:b w:val="0"/>
                 <w:i w:val="0"/>
                 <w:sz w:val="18"/>
+                <w:u w:val="none"/>
               </w:rPr>
-              <w:t>• Admin can view weekly appointment summaries.</w:t>
+              <w:t>• Admin can view a weekly appointment summary.</w:t>
             </w:r>
           </w:p>
         </w:tc>
@@ -795,11 +1155,20 @@
       <w:tr>
         <w:tc>
           <w:tcPr>
-            <w:tcW w:type="dxa" w:w="1984"/>
-            <w:shd w:val="clear" w:color="auto" w:fill="70AD47"/>
+            <w:tcW w:type="dxa" w:w="2154"/>
+            <w:shd w:val="clear" w:color="auto" w:fill="7F9443"/>
+            <w:tcBorders>
+              <w:top w:val="single" w:sz="4" w:space="0" w:color="596B3B"/>
+              <w:left w:val="single" w:sz="4" w:space="0" w:color="596B3B"/>
+              <w:bottom w:val="single" w:sz="4" w:space="0" w:color="596B3B"/>
+              <w:right w:val="single" w:sz="4" w:space="0" w:color="596B3B"/>
+              <w:insideH w:val="single" w:sz="4" w:space="0" w:color="596B3B"/>
+              <w:insideV w:val="single" w:sz="4" w:space="0" w:color="596B3B"/>
+            </w:tcBorders>
           </w:tcPr>
           <w:p>
             <w:pPr>
+              <w:spacing w:before="40" w:after="40"/>
               <w:jc w:val="center"/>
             </w:pPr>
             <w:r>
@@ -808,6 +1177,7 @@
                 <w:i w:val="0"/>
                 <w:color w:val="FFFFFF"/>
                 <w:sz w:val="18"/>
+                <w:u w:val="none"/>
               </w:rPr>
               <w:t>Student</w:t>
               <w:br/>
@@ -817,11 +1187,20 @@
         </w:tc>
         <w:tc>
           <w:tcPr>
-            <w:tcW w:type="dxa" w:w="6803"/>
-            <w:shd w:val="clear" w:color="auto" w:fill="70AD47"/>
+            <w:tcW w:type="dxa" w:w="6520"/>
+            <w:shd w:val="clear" w:color="auto" w:fill="7F9443"/>
+            <w:tcBorders>
+              <w:top w:val="single" w:sz="4" w:space="0" w:color="596B3B"/>
+              <w:left w:val="single" w:sz="4" w:space="0" w:color="596B3B"/>
+              <w:bottom w:val="single" w:sz="4" w:space="0" w:color="596B3B"/>
+              <w:right w:val="single" w:sz="4" w:space="0" w:color="596B3B"/>
+              <w:insideH w:val="single" w:sz="4" w:space="0" w:color="596B3B"/>
+              <w:insideV w:val="single" w:sz="4" w:space="0" w:color="596B3B"/>
+            </w:tcBorders>
           </w:tcPr>
           <w:p>
             <w:pPr>
+              <w:spacing w:before="40" w:after="40"/>
               <w:jc w:val="both"/>
             </w:pPr>
             <w:r>
@@ -830,6 +1209,7 @@
                 <w:i w:val="0"/>
                 <w:color w:val="FFFFFF"/>
                 <w:sz w:val="18"/>
+                <w:u w:val="none"/>
               </w:rPr>
               <w:t xml:space="preserve">User Story: </w:t>
             </w:r>
@@ -839,6 +1219,7 @@
                 <w:i w:val="0"/>
                 <w:color w:val="FFFFFF"/>
                 <w:sz w:val="18"/>
+                <w:u w:val="none"/>
               </w:rPr>
               <w:t>As a nurse, I want to view student medical records so that treatment decisions are well-informed.</w:t>
             </w:r>
@@ -848,15 +1229,28 @@
       <w:tr>
         <w:tc>
           <w:tcPr>
-            <w:tcW w:type="dxa" w:w="8787"/>
+            <w:tcW w:type="dxa" w:w="8674"/>
             <w:gridSpan w:val="2"/>
+            <w:tcBorders>
+              <w:top w:val="single" w:sz="4" w:space="0" w:color="596B3B"/>
+              <w:left w:val="single" w:sz="4" w:space="0" w:color="596B3B"/>
+              <w:bottom w:val="single" w:sz="4" w:space="0" w:color="596B3B"/>
+              <w:right w:val="single" w:sz="4" w:space="0" w:color="596B3B"/>
+              <w:insideH w:val="single" w:sz="4" w:space="0" w:color="596B3B"/>
+              <w:insideV w:val="single" w:sz="4" w:space="0" w:color="596B3B"/>
+            </w:tcBorders>
           </w:tcPr>
           <w:p>
+            <w:pPr>
+              <w:spacing w:before="40" w:after="20"/>
+              <w:ind w:left="113"/>
+            </w:pPr>
             <w:r>
               <w:rPr>
                 <w:b/>
                 <w:i w:val="0"/>
                 <w:sz w:val="18"/>
+                <w:u w:val="none"/>
               </w:rPr>
               <w:t>Tasks:</w:t>
             </w:r>
@@ -866,11 +1260,20 @@
       <w:tr>
         <w:tc>
           <w:tcPr>
-            <w:tcW w:type="dxa" w:w="8787"/>
+            <w:tcW w:type="dxa" w:w="8674"/>
             <w:gridSpan w:val="2"/>
+            <w:tcBorders>
+              <w:top w:val="single" w:sz="4" w:space="0" w:color="596B3B"/>
+              <w:left w:val="single" w:sz="4" w:space="0" w:color="596B3B"/>
+              <w:bottom w:val="single" w:sz="4" w:space="0" w:color="596B3B"/>
+              <w:right w:val="single" w:sz="4" w:space="0" w:color="596B3B"/>
+              <w:insideH w:val="single" w:sz="4" w:space="0" w:color="596B3B"/>
+              <w:insideV w:val="single" w:sz="4" w:space="0" w:color="596B3B"/>
+            </w:tcBorders>
           </w:tcPr>
           <w:p>
             <w:pPr>
+              <w:spacing w:before="20" w:after="20"/>
               <w:ind w:left="283"/>
             </w:pPr>
             <w:r>
@@ -878,6 +1281,7 @@
                 <w:b w:val="0"/>
                 <w:i w:val="0"/>
                 <w:sz w:val="18"/>
+                <w:u w:val="none"/>
               </w:rPr>
               <w:t>• Nurse can search for and view student medical records.</w:t>
             </w:r>
@@ -887,11 +1291,20 @@
       <w:tr>
         <w:tc>
           <w:tcPr>
-            <w:tcW w:type="dxa" w:w="8787"/>
+            <w:tcW w:type="dxa" w:w="8674"/>
             <w:gridSpan w:val="2"/>
+            <w:tcBorders>
+              <w:top w:val="single" w:sz="4" w:space="0" w:color="596B3B"/>
+              <w:left w:val="single" w:sz="4" w:space="0" w:color="596B3B"/>
+              <w:bottom w:val="single" w:sz="4" w:space="0" w:color="596B3B"/>
+              <w:right w:val="single" w:sz="4" w:space="0" w:color="596B3B"/>
+              <w:insideH w:val="single" w:sz="4" w:space="0" w:color="596B3B"/>
+              <w:insideV w:val="single" w:sz="4" w:space="0" w:color="596B3B"/>
+            </w:tcBorders>
           </w:tcPr>
           <w:p>
             <w:pPr>
+              <w:spacing w:before="20" w:after="20"/>
               <w:ind w:left="283"/>
             </w:pPr>
             <w:r>
@@ -899,6 +1312,7 @@
                 <w:b w:val="0"/>
                 <w:i w:val="0"/>
                 <w:sz w:val="18"/>
+                <w:u w:val="none"/>
               </w:rPr>
               <w:t>• Records include past clinic visits and noted conditions.</w:t>
             </w:r>
@@ -908,11 +1322,20 @@
       <w:tr>
         <w:tc>
           <w:tcPr>
-            <w:tcW w:type="dxa" w:w="1984"/>
-            <w:shd w:val="clear" w:color="auto" w:fill="70AD47"/>
+            <w:tcW w:type="dxa" w:w="2154"/>
+            <w:shd w:val="clear" w:color="auto" w:fill="7F9443"/>
+            <w:tcBorders>
+              <w:top w:val="single" w:sz="4" w:space="0" w:color="596B3B"/>
+              <w:left w:val="single" w:sz="4" w:space="0" w:color="596B3B"/>
+              <w:bottom w:val="single" w:sz="4" w:space="0" w:color="596B3B"/>
+              <w:right w:val="single" w:sz="4" w:space="0" w:color="596B3B"/>
+              <w:insideH w:val="single" w:sz="4" w:space="0" w:color="596B3B"/>
+              <w:insideV w:val="single" w:sz="4" w:space="0" w:color="596B3B"/>
+            </w:tcBorders>
           </w:tcPr>
           <w:p>
             <w:pPr>
+              <w:spacing w:before="40" w:after="40"/>
               <w:jc w:val="center"/>
             </w:pPr>
             <w:r>
@@ -921,6 +1344,7 @@
                 <w:i w:val="0"/>
                 <w:color w:val="FFFFFF"/>
                 <w:sz w:val="18"/>
+                <w:u w:val="none"/>
               </w:rPr>
               <w:t>Emergency</w:t>
               <w:br/>
@@ -930,11 +1354,20 @@
         </w:tc>
         <w:tc>
           <w:tcPr>
-            <w:tcW w:type="dxa" w:w="6803"/>
-            <w:shd w:val="clear" w:color="auto" w:fill="70AD47"/>
+            <w:tcW w:type="dxa" w:w="6520"/>
+            <w:shd w:val="clear" w:color="auto" w:fill="7F9443"/>
+            <w:tcBorders>
+              <w:top w:val="single" w:sz="4" w:space="0" w:color="596B3B"/>
+              <w:left w:val="single" w:sz="4" w:space="0" w:color="596B3B"/>
+              <w:bottom w:val="single" w:sz="4" w:space="0" w:color="596B3B"/>
+              <w:right w:val="single" w:sz="4" w:space="0" w:color="596B3B"/>
+              <w:insideH w:val="single" w:sz="4" w:space="0" w:color="596B3B"/>
+              <w:insideV w:val="single" w:sz="4" w:space="0" w:color="596B3B"/>
+            </w:tcBorders>
           </w:tcPr>
           <w:p>
             <w:pPr>
+              <w:spacing w:before="40" w:after="40"/>
               <w:jc w:val="both"/>
             </w:pPr>
             <w:r>
@@ -943,6 +1376,7 @@
                 <w:i w:val="0"/>
                 <w:color w:val="FFFFFF"/>
                 <w:sz w:val="18"/>
+                <w:u w:val="none"/>
               </w:rPr>
               <w:t xml:space="preserve">User Story: </w:t>
             </w:r>
@@ -952,6 +1386,7 @@
                 <w:i w:val="0"/>
                 <w:color w:val="FFFFFF"/>
                 <w:sz w:val="18"/>
+                <w:u w:val="none"/>
               </w:rPr>
               <w:t>As a nurse, I want to create and review emergency records so that urgent cases are properly documented.</w:t>
             </w:r>
@@ -961,15 +1396,28 @@
       <w:tr>
         <w:tc>
           <w:tcPr>
-            <w:tcW w:type="dxa" w:w="8787"/>
+            <w:tcW w:type="dxa" w:w="8674"/>
             <w:gridSpan w:val="2"/>
+            <w:tcBorders>
+              <w:top w:val="single" w:sz="4" w:space="0" w:color="596B3B"/>
+              <w:left w:val="single" w:sz="4" w:space="0" w:color="596B3B"/>
+              <w:bottom w:val="single" w:sz="4" w:space="0" w:color="596B3B"/>
+              <w:right w:val="single" w:sz="4" w:space="0" w:color="596B3B"/>
+              <w:insideH w:val="single" w:sz="4" w:space="0" w:color="596B3B"/>
+              <w:insideV w:val="single" w:sz="4" w:space="0" w:color="596B3B"/>
+            </w:tcBorders>
           </w:tcPr>
           <w:p>
+            <w:pPr>
+              <w:spacing w:before="40" w:after="20"/>
+              <w:ind w:left="113"/>
+            </w:pPr>
             <w:r>
               <w:rPr>
                 <w:b/>
                 <w:i w:val="0"/>
                 <w:sz w:val="18"/>
+                <w:u w:val="none"/>
               </w:rPr>
               <w:t>Tasks:</w:t>
             </w:r>
@@ -979,11 +1427,20 @@
       <w:tr>
         <w:tc>
           <w:tcPr>
-            <w:tcW w:type="dxa" w:w="8787"/>
+            <w:tcW w:type="dxa" w:w="8674"/>
             <w:gridSpan w:val="2"/>
+            <w:tcBorders>
+              <w:top w:val="single" w:sz="4" w:space="0" w:color="596B3B"/>
+              <w:left w:val="single" w:sz="4" w:space="0" w:color="596B3B"/>
+              <w:bottom w:val="single" w:sz="4" w:space="0" w:color="596B3B"/>
+              <w:right w:val="single" w:sz="4" w:space="0" w:color="596B3B"/>
+              <w:insideH w:val="single" w:sz="4" w:space="0" w:color="596B3B"/>
+              <w:insideV w:val="single" w:sz="4" w:space="0" w:color="596B3B"/>
+            </w:tcBorders>
           </w:tcPr>
           <w:p>
             <w:pPr>
+              <w:spacing w:before="20" w:after="20"/>
               <w:ind w:left="283"/>
             </w:pPr>
             <w:r>
@@ -991,6 +1448,7 @@
                 <w:b w:val="0"/>
                 <w:i w:val="0"/>
                 <w:sz w:val="18"/>
+                <w:u w:val="none"/>
               </w:rPr>
               <w:t>• Nurse can create an emergency record for a student.</w:t>
             </w:r>
@@ -1000,11 +1458,20 @@
       <w:tr>
         <w:tc>
           <w:tcPr>
-            <w:tcW w:type="dxa" w:w="8787"/>
+            <w:tcW w:type="dxa" w:w="8674"/>
             <w:gridSpan w:val="2"/>
+            <w:tcBorders>
+              <w:top w:val="single" w:sz="4" w:space="0" w:color="596B3B"/>
+              <w:left w:val="single" w:sz="4" w:space="0" w:color="596B3B"/>
+              <w:bottom w:val="single" w:sz="4" w:space="0" w:color="596B3B"/>
+              <w:right w:val="single" w:sz="4" w:space="0" w:color="596B3B"/>
+              <w:insideH w:val="single" w:sz="4" w:space="0" w:color="596B3B"/>
+              <w:insideV w:val="single" w:sz="4" w:space="0" w:color="596B3B"/>
+            </w:tcBorders>
           </w:tcPr>
           <w:p>
             <w:pPr>
+              <w:spacing w:before="20" w:after="20"/>
               <w:ind w:left="283"/>
             </w:pPr>
             <w:r>
@@ -1012,6 +1479,7 @@
                 <w:b w:val="0"/>
                 <w:i w:val="0"/>
                 <w:sz w:val="18"/>
+                <w:u w:val="none"/>
               </w:rPr>
               <w:t>• Nurse can view and list all emergency records.</w:t>
             </w:r>
@@ -1021,11 +1489,20 @@
       <w:tr>
         <w:tc>
           <w:tcPr>
-            <w:tcW w:type="dxa" w:w="8787"/>
+            <w:tcW w:type="dxa" w:w="8674"/>
             <w:gridSpan w:val="2"/>
+            <w:tcBorders>
+              <w:top w:val="single" w:sz="4" w:space="0" w:color="596B3B"/>
+              <w:left w:val="single" w:sz="4" w:space="0" w:color="596B3B"/>
+              <w:bottom w:val="single" w:sz="4" w:space="0" w:color="596B3B"/>
+              <w:right w:val="single" w:sz="4" w:space="0" w:color="596B3B"/>
+              <w:insideH w:val="single" w:sz="4" w:space="0" w:color="596B3B"/>
+              <w:insideV w:val="single" w:sz="4" w:space="0" w:color="596B3B"/>
+            </w:tcBorders>
           </w:tcPr>
           <w:p>
             <w:pPr>
+              <w:spacing w:before="20" w:after="20"/>
               <w:ind w:left="283"/>
             </w:pPr>
             <w:r>
@@ -1033,8 +1510,9 @@
                 <w:b w:val="0"/>
                 <w:i w:val="0"/>
                 <w:sz w:val="18"/>
+                <w:u w:val="none"/>
               </w:rPr>
-              <w:t>• Detail view available per emergency record.</w:t>
+              <w:t>• Detail view is available per emergency record.</w:t>
             </w:r>
           </w:p>
         </w:tc>
@@ -1042,11 +1520,20 @@
       <w:tr>
         <w:tc>
           <w:tcPr>
-            <w:tcW w:type="dxa" w:w="1984"/>
-            <w:shd w:val="clear" w:color="auto" w:fill="70AD47"/>
+            <w:tcW w:type="dxa" w:w="2154"/>
+            <w:shd w:val="clear" w:color="auto" w:fill="7F9443"/>
+            <w:tcBorders>
+              <w:top w:val="single" w:sz="4" w:space="0" w:color="596B3B"/>
+              <w:left w:val="single" w:sz="4" w:space="0" w:color="596B3B"/>
+              <w:bottom w:val="single" w:sz="4" w:space="0" w:color="596B3B"/>
+              <w:right w:val="single" w:sz="4" w:space="0" w:color="596B3B"/>
+              <w:insideH w:val="single" w:sz="4" w:space="0" w:color="596B3B"/>
+              <w:insideV w:val="single" w:sz="4" w:space="0" w:color="596B3B"/>
+            </w:tcBorders>
           </w:tcPr>
           <w:p>
             <w:pPr>
+              <w:spacing w:before="40" w:after="40"/>
               <w:jc w:val="center"/>
             </w:pPr>
             <w:r>
@@ -1055,6 +1542,7 @@
                 <w:i w:val="0"/>
                 <w:color w:val="FFFFFF"/>
                 <w:sz w:val="18"/>
+                <w:u w:val="none"/>
               </w:rPr>
               <w:t>Notifications</w:t>
             </w:r>
@@ -1062,11 +1550,20 @@
         </w:tc>
         <w:tc>
           <w:tcPr>
-            <w:tcW w:type="dxa" w:w="6803"/>
-            <w:shd w:val="clear" w:color="auto" w:fill="70AD47"/>
+            <w:tcW w:type="dxa" w:w="6520"/>
+            <w:shd w:val="clear" w:color="auto" w:fill="7F9443"/>
+            <w:tcBorders>
+              <w:top w:val="single" w:sz="4" w:space="0" w:color="596B3B"/>
+              <w:left w:val="single" w:sz="4" w:space="0" w:color="596B3B"/>
+              <w:bottom w:val="single" w:sz="4" w:space="0" w:color="596B3B"/>
+              <w:right w:val="single" w:sz="4" w:space="0" w:color="596B3B"/>
+              <w:insideH w:val="single" w:sz="4" w:space="0" w:color="596B3B"/>
+              <w:insideV w:val="single" w:sz="4" w:space="0" w:color="596B3B"/>
+            </w:tcBorders>
           </w:tcPr>
           <w:p>
             <w:pPr>
+              <w:spacing w:before="40" w:after="40"/>
               <w:jc w:val="both"/>
             </w:pPr>
             <w:r>
@@ -1075,6 +1572,7 @@
                 <w:i w:val="0"/>
                 <w:color w:val="FFFFFF"/>
                 <w:sz w:val="18"/>
+                <w:u w:val="none"/>
               </w:rPr>
               <w:t xml:space="preserve">User Story: </w:t>
             </w:r>
@@ -1084,6 +1582,7 @@
                 <w:i w:val="0"/>
                 <w:color w:val="FFFFFF"/>
                 <w:sz w:val="18"/>
+                <w:u w:val="none"/>
               </w:rPr>
               <w:t>As a user, I want in-app notifications with read tracking so that I stay informed about appointment activity.</w:t>
             </w:r>
@@ -1093,15 +1592,28 @@
       <w:tr>
         <w:tc>
           <w:tcPr>
-            <w:tcW w:type="dxa" w:w="8787"/>
+            <w:tcW w:type="dxa" w:w="8674"/>
             <w:gridSpan w:val="2"/>
+            <w:tcBorders>
+              <w:top w:val="single" w:sz="4" w:space="0" w:color="596B3B"/>
+              <w:left w:val="single" w:sz="4" w:space="0" w:color="596B3B"/>
+              <w:bottom w:val="single" w:sz="4" w:space="0" w:color="596B3B"/>
+              <w:right w:val="single" w:sz="4" w:space="0" w:color="596B3B"/>
+              <w:insideH w:val="single" w:sz="4" w:space="0" w:color="596B3B"/>
+              <w:insideV w:val="single" w:sz="4" w:space="0" w:color="596B3B"/>
+            </w:tcBorders>
           </w:tcPr>
           <w:p>
+            <w:pPr>
+              <w:spacing w:before="40" w:after="20"/>
+              <w:ind w:left="113"/>
+            </w:pPr>
             <w:r>
               <w:rPr>
                 <w:b/>
                 <w:i w:val="0"/>
                 <w:sz w:val="18"/>
+                <w:u w:val="none"/>
               </w:rPr>
               <w:t>Tasks:</w:t>
             </w:r>
@@ -1111,11 +1623,20 @@
       <w:tr>
         <w:tc>
           <w:tcPr>
-            <w:tcW w:type="dxa" w:w="8787"/>
+            <w:tcW w:type="dxa" w:w="8674"/>
             <w:gridSpan w:val="2"/>
+            <w:tcBorders>
+              <w:top w:val="single" w:sz="4" w:space="0" w:color="596B3B"/>
+              <w:left w:val="single" w:sz="4" w:space="0" w:color="596B3B"/>
+              <w:bottom w:val="single" w:sz="4" w:space="0" w:color="596B3B"/>
+              <w:right w:val="single" w:sz="4" w:space="0" w:color="596B3B"/>
+              <w:insideH w:val="single" w:sz="4" w:space="0" w:color="596B3B"/>
+              <w:insideV w:val="single" w:sz="4" w:space="0" w:color="596B3B"/>
+            </w:tcBorders>
           </w:tcPr>
           <w:p>
             <w:pPr>
+              <w:spacing w:before="20" w:after="20"/>
               <w:ind w:left="283"/>
             </w:pPr>
             <w:r>
@@ -1123,6 +1644,7 @@
                 <w:b w:val="0"/>
                 <w:i w:val="0"/>
                 <w:sz w:val="18"/>
+                <w:u w:val="none"/>
               </w:rPr>
               <w:t>• Users receive in-app notifications for appointment events.</w:t>
             </w:r>
@@ -1132,11 +1654,20 @@
       <w:tr>
         <w:tc>
           <w:tcPr>
-            <w:tcW w:type="dxa" w:w="8787"/>
+            <w:tcW w:type="dxa" w:w="8674"/>
             <w:gridSpan w:val="2"/>
+            <w:tcBorders>
+              <w:top w:val="single" w:sz="4" w:space="0" w:color="596B3B"/>
+              <w:left w:val="single" w:sz="4" w:space="0" w:color="596B3B"/>
+              <w:bottom w:val="single" w:sz="4" w:space="0" w:color="596B3B"/>
+              <w:right w:val="single" w:sz="4" w:space="0" w:color="596B3B"/>
+              <w:insideH w:val="single" w:sz="4" w:space="0" w:color="596B3B"/>
+              <w:insideV w:val="single" w:sz="4" w:space="0" w:color="596B3B"/>
+            </w:tcBorders>
           </w:tcPr>
           <w:p>
             <w:pPr>
+              <w:spacing w:before="20" w:after="20"/>
               <w:ind w:left="283"/>
             </w:pPr>
             <w:r>
@@ -1144,6 +1675,7 @@
                 <w:b w:val="0"/>
                 <w:i w:val="0"/>
                 <w:sz w:val="18"/>
+                <w:u w:val="none"/>
               </w:rPr>
               <w:t>• Users can mark individual notifications as read.</w:t>
             </w:r>
@@ -1153,11 +1685,20 @@
       <w:tr>
         <w:tc>
           <w:tcPr>
-            <w:tcW w:type="dxa" w:w="8787"/>
+            <w:tcW w:type="dxa" w:w="8674"/>
             <w:gridSpan w:val="2"/>
+            <w:tcBorders>
+              <w:top w:val="single" w:sz="4" w:space="0" w:color="596B3B"/>
+              <w:left w:val="single" w:sz="4" w:space="0" w:color="596B3B"/>
+              <w:bottom w:val="single" w:sz="4" w:space="0" w:color="596B3B"/>
+              <w:right w:val="single" w:sz="4" w:space="0" w:color="596B3B"/>
+              <w:insideH w:val="single" w:sz="4" w:space="0" w:color="596B3B"/>
+              <w:insideV w:val="single" w:sz="4" w:space="0" w:color="596B3B"/>
+            </w:tcBorders>
           </w:tcPr>
           <w:p>
             <w:pPr>
+              <w:spacing w:before="20" w:after="20"/>
               <w:ind w:left="283"/>
             </w:pPr>
             <w:r>
@@ -1165,6 +1706,7 @@
                 <w:b w:val="0"/>
                 <w:i w:val="0"/>
                 <w:sz w:val="18"/>
+                <w:u w:val="none"/>
               </w:rPr>
               <w:t>• Users can mark all notifications as read at once.</w:t>
             </w:r>
@@ -1174,11 +1716,20 @@
       <w:tr>
         <w:tc>
           <w:tcPr>
-            <w:tcW w:type="dxa" w:w="8787"/>
+            <w:tcW w:type="dxa" w:w="8674"/>
             <w:gridSpan w:val="2"/>
+            <w:tcBorders>
+              <w:top w:val="single" w:sz="4" w:space="0" w:color="596B3B"/>
+              <w:left w:val="single" w:sz="4" w:space="0" w:color="596B3B"/>
+              <w:bottom w:val="single" w:sz="4" w:space="0" w:color="596B3B"/>
+              <w:right w:val="single" w:sz="4" w:space="0" w:color="596B3B"/>
+              <w:insideH w:val="single" w:sz="4" w:space="0" w:color="596B3B"/>
+              <w:insideV w:val="single" w:sz="4" w:space="0" w:color="596B3B"/>
+            </w:tcBorders>
           </w:tcPr>
           <w:p>
             <w:pPr>
+              <w:spacing w:before="20" w:after="20"/>
               <w:ind w:left="283"/>
             </w:pPr>
             <w:r>
@@ -1186,6 +1737,7 @@
                 <w:b w:val="0"/>
                 <w:i w:val="0"/>
                 <w:sz w:val="18"/>
+                <w:u w:val="none"/>
               </w:rPr>
               <w:t>• Notification count badge updates in real time.</w:t>
             </w:r>
@@ -1195,11 +1747,20 @@
       <w:tr>
         <w:tc>
           <w:tcPr>
-            <w:tcW w:type="dxa" w:w="1984"/>
-            <w:shd w:val="clear" w:color="auto" w:fill="70AD47"/>
+            <w:tcW w:type="dxa" w:w="2154"/>
+            <w:shd w:val="clear" w:color="auto" w:fill="7F9443"/>
+            <w:tcBorders>
+              <w:top w:val="single" w:sz="4" w:space="0" w:color="596B3B"/>
+              <w:left w:val="single" w:sz="4" w:space="0" w:color="596B3B"/>
+              <w:bottom w:val="single" w:sz="4" w:space="0" w:color="596B3B"/>
+              <w:right w:val="single" w:sz="4" w:space="0" w:color="596B3B"/>
+              <w:insideH w:val="single" w:sz="4" w:space="0" w:color="596B3B"/>
+              <w:insideV w:val="single" w:sz="4" w:space="0" w:color="596B3B"/>
+            </w:tcBorders>
           </w:tcPr>
           <w:p>
             <w:pPr>
+              <w:spacing w:before="40" w:after="40"/>
               <w:jc w:val="center"/>
             </w:pPr>
             <w:r>
@@ -1208,6 +1769,7 @@
                 <w:i w:val="0"/>
                 <w:color w:val="FFFFFF"/>
                 <w:sz w:val="18"/>
+                <w:u w:val="none"/>
               </w:rPr>
               <w:t>Guardian</w:t>
               <w:br/>
@@ -1217,11 +1779,20 @@
         </w:tc>
         <w:tc>
           <w:tcPr>
-            <w:tcW w:type="dxa" w:w="6803"/>
-            <w:shd w:val="clear" w:color="auto" w:fill="70AD47"/>
+            <w:tcW w:type="dxa" w:w="6520"/>
+            <w:shd w:val="clear" w:color="auto" w:fill="7F9443"/>
+            <w:tcBorders>
+              <w:top w:val="single" w:sz="4" w:space="0" w:color="596B3B"/>
+              <w:left w:val="single" w:sz="4" w:space="0" w:color="596B3B"/>
+              <w:bottom w:val="single" w:sz="4" w:space="0" w:color="596B3B"/>
+              <w:right w:val="single" w:sz="4" w:space="0" w:color="596B3B"/>
+              <w:insideH w:val="single" w:sz="4" w:space="0" w:color="596B3B"/>
+              <w:insideV w:val="single" w:sz="4" w:space="0" w:color="596B3B"/>
+            </w:tcBorders>
           </w:tcPr>
           <w:p>
             <w:pPr>
+              <w:spacing w:before="40" w:after="40"/>
               <w:jc w:val="both"/>
             </w:pPr>
             <w:r>
@@ -1230,6 +1801,7 @@
                 <w:i w:val="0"/>
                 <w:color w:val="FFFFFF"/>
                 <w:sz w:val="18"/>
+                <w:u w:val="none"/>
               </w:rPr>
               <w:t xml:space="preserve">User Story: </w:t>
             </w:r>
@@ -1239,6 +1811,7 @@
                 <w:i w:val="0"/>
                 <w:color w:val="FFFFFF"/>
                 <w:sz w:val="18"/>
+                <w:u w:val="none"/>
               </w:rPr>
               <w:t>As clinic staff, I want to send guardian SMS notifications so that guardians are informed when needed.</w:t>
             </w:r>
@@ -1248,15 +1821,28 @@
       <w:tr>
         <w:tc>
           <w:tcPr>
-            <w:tcW w:type="dxa" w:w="8787"/>
+            <w:tcW w:type="dxa" w:w="8674"/>
             <w:gridSpan w:val="2"/>
+            <w:tcBorders>
+              <w:top w:val="single" w:sz="4" w:space="0" w:color="596B3B"/>
+              <w:left w:val="single" w:sz="4" w:space="0" w:color="596B3B"/>
+              <w:bottom w:val="single" w:sz="4" w:space="0" w:color="596B3B"/>
+              <w:right w:val="single" w:sz="4" w:space="0" w:color="596B3B"/>
+              <w:insideH w:val="single" w:sz="4" w:space="0" w:color="596B3B"/>
+              <w:insideV w:val="single" w:sz="4" w:space="0" w:color="596B3B"/>
+            </w:tcBorders>
           </w:tcPr>
           <w:p>
+            <w:pPr>
+              <w:spacing w:before="40" w:after="20"/>
+              <w:ind w:left="113"/>
+            </w:pPr>
             <w:r>
               <w:rPr>
                 <w:b/>
                 <w:i w:val="0"/>
                 <w:sz w:val="18"/>
+                <w:u w:val="none"/>
               </w:rPr>
               <w:t>Tasks:</w:t>
             </w:r>
@@ -1266,11 +1852,20 @@
       <w:tr>
         <w:tc>
           <w:tcPr>
-            <w:tcW w:type="dxa" w:w="8787"/>
+            <w:tcW w:type="dxa" w:w="8674"/>
             <w:gridSpan w:val="2"/>
+            <w:tcBorders>
+              <w:top w:val="single" w:sz="4" w:space="0" w:color="596B3B"/>
+              <w:left w:val="single" w:sz="4" w:space="0" w:color="596B3B"/>
+              <w:bottom w:val="single" w:sz="4" w:space="0" w:color="596B3B"/>
+              <w:right w:val="single" w:sz="4" w:space="0" w:color="596B3B"/>
+              <w:insideH w:val="single" w:sz="4" w:space="0" w:color="596B3B"/>
+              <w:insideV w:val="single" w:sz="4" w:space="0" w:color="596B3B"/>
+            </w:tcBorders>
           </w:tcPr>
           <w:p>
             <w:pPr>
+              <w:spacing w:before="20" w:after="20"/>
               <w:ind w:left="283"/>
             </w:pPr>
             <w:r>
@@ -1278,6 +1873,7 @@
                 <w:b w:val="0"/>
                 <w:i w:val="0"/>
                 <w:sz w:val="18"/>
+                <w:u w:val="none"/>
               </w:rPr>
               <w:t>• Staff can manually send an SMS to a student's guardian.</w:t>
             </w:r>
@@ -1287,11 +1883,20 @@
       <w:tr>
         <w:tc>
           <w:tcPr>
-            <w:tcW w:type="dxa" w:w="8787"/>
+            <w:tcW w:type="dxa" w:w="8674"/>
             <w:gridSpan w:val="2"/>
+            <w:tcBorders>
+              <w:top w:val="single" w:sz="4" w:space="0" w:color="596B3B"/>
+              <w:left w:val="single" w:sz="4" w:space="0" w:color="596B3B"/>
+              <w:bottom w:val="single" w:sz="4" w:space="0" w:color="596B3B"/>
+              <w:right w:val="single" w:sz="4" w:space="0" w:color="596B3B"/>
+              <w:insideH w:val="single" w:sz="4" w:space="0" w:color="596B3B"/>
+              <w:insideV w:val="single" w:sz="4" w:space="0" w:color="596B3B"/>
+            </w:tcBorders>
           </w:tcPr>
           <w:p>
             <w:pPr>
+              <w:spacing w:before="20" w:after="20"/>
               <w:ind w:left="283"/>
             </w:pPr>
             <w:r>
@@ -1299,6 +1904,7 @@
                 <w:b w:val="0"/>
                 <w:i w:val="0"/>
                 <w:sz w:val="18"/>
+                <w:u w:val="none"/>
               </w:rPr>
               <w:t>• Automatic SMS is triggered on appointment-linked events.</w:t>
             </w:r>
@@ -1308,11 +1914,20 @@
       <w:tr>
         <w:tc>
           <w:tcPr>
-            <w:tcW w:type="dxa" w:w="8787"/>
+            <w:tcW w:type="dxa" w:w="8674"/>
             <w:gridSpan w:val="2"/>
+            <w:tcBorders>
+              <w:top w:val="single" w:sz="4" w:space="0" w:color="596B3B"/>
+              <w:left w:val="single" w:sz="4" w:space="0" w:color="596B3B"/>
+              <w:bottom w:val="single" w:sz="4" w:space="0" w:color="596B3B"/>
+              <w:right w:val="single" w:sz="4" w:space="0" w:color="596B3B"/>
+              <w:insideH w:val="single" w:sz="4" w:space="0" w:color="596B3B"/>
+              <w:insideV w:val="single" w:sz="4" w:space="0" w:color="596B3B"/>
+            </w:tcBorders>
           </w:tcPr>
           <w:p>
             <w:pPr>
+              <w:spacing w:before="20" w:after="20"/>
               <w:ind w:left="283"/>
             </w:pPr>
             <w:r>
@@ -1320,6 +1935,7 @@
                 <w:b w:val="0"/>
                 <w:i w:val="0"/>
                 <w:sz w:val="18"/>
+                <w:u w:val="none"/>
               </w:rPr>
               <w:t>• SMS log is viewable from the Guardian SMS module.</w:t>
             </w:r>
@@ -1329,11 +1945,20 @@
       <w:tr>
         <w:tc>
           <w:tcPr>
-            <w:tcW w:type="dxa" w:w="1984"/>
-            <w:shd w:val="clear" w:color="auto" w:fill="70AD47"/>
+            <w:tcW w:type="dxa" w:w="2154"/>
+            <w:shd w:val="clear" w:color="auto" w:fill="7F9443"/>
+            <w:tcBorders>
+              <w:top w:val="single" w:sz="4" w:space="0" w:color="596B3B"/>
+              <w:left w:val="single" w:sz="4" w:space="0" w:color="596B3B"/>
+              <w:bottom w:val="single" w:sz="4" w:space="0" w:color="596B3B"/>
+              <w:right w:val="single" w:sz="4" w:space="0" w:color="596B3B"/>
+              <w:insideH w:val="single" w:sz="4" w:space="0" w:color="596B3B"/>
+              <w:insideV w:val="single" w:sz="4" w:space="0" w:color="596B3B"/>
+            </w:tcBorders>
           </w:tcPr>
           <w:p>
             <w:pPr>
+              <w:spacing w:before="40" w:after="40"/>
               <w:jc w:val="center"/>
             </w:pPr>
             <w:r>
@@ -1342,6 +1967,7 @@
                 <w:i w:val="0"/>
                 <w:color w:val="FFFFFF"/>
                 <w:sz w:val="18"/>
+                <w:u w:val="none"/>
               </w:rPr>
               <w:t>Reporting</w:t>
             </w:r>
@@ -1349,11 +1975,20 @@
         </w:tc>
         <w:tc>
           <w:tcPr>
-            <w:tcW w:type="dxa" w:w="6803"/>
-            <w:shd w:val="clear" w:color="auto" w:fill="70AD47"/>
+            <w:tcW w:type="dxa" w:w="6520"/>
+            <w:shd w:val="clear" w:color="auto" w:fill="7F9443"/>
+            <w:tcBorders>
+              <w:top w:val="single" w:sz="4" w:space="0" w:color="596B3B"/>
+              <w:left w:val="single" w:sz="4" w:space="0" w:color="596B3B"/>
+              <w:bottom w:val="single" w:sz="4" w:space="0" w:color="596B3B"/>
+              <w:right w:val="single" w:sz="4" w:space="0" w:color="596B3B"/>
+              <w:insideH w:val="single" w:sz="4" w:space="0" w:color="596B3B"/>
+              <w:insideV w:val="single" w:sz="4" w:space="0" w:color="596B3B"/>
+            </w:tcBorders>
           </w:tcPr>
           <w:p>
             <w:pPr>
+              <w:spacing w:before="40" w:after="40"/>
               <w:jc w:val="both"/>
             </w:pPr>
             <w:r>
@@ -1362,6 +1997,7 @@
                 <w:i w:val="0"/>
                 <w:color w:val="FFFFFF"/>
                 <w:sz w:val="18"/>
+                <w:u w:val="none"/>
               </w:rPr>
               <w:t xml:space="preserve">User Story: </w:t>
             </w:r>
@@ -1371,6 +2007,7 @@
                 <w:i w:val="0"/>
                 <w:color w:val="FFFFFF"/>
                 <w:sz w:val="18"/>
+                <w:u w:val="none"/>
               </w:rPr>
               <w:t>As an admin, I want monthly reports so that I can review service trends and outcomes.</w:t>
             </w:r>
@@ -1380,15 +2017,28 @@
       <w:tr>
         <w:tc>
           <w:tcPr>
-            <w:tcW w:type="dxa" w:w="8787"/>
+            <w:tcW w:type="dxa" w:w="8674"/>
             <w:gridSpan w:val="2"/>
+            <w:tcBorders>
+              <w:top w:val="single" w:sz="4" w:space="0" w:color="596B3B"/>
+              <w:left w:val="single" w:sz="4" w:space="0" w:color="596B3B"/>
+              <w:bottom w:val="single" w:sz="4" w:space="0" w:color="596B3B"/>
+              <w:right w:val="single" w:sz="4" w:space="0" w:color="596B3B"/>
+              <w:insideH w:val="single" w:sz="4" w:space="0" w:color="596B3B"/>
+              <w:insideV w:val="single" w:sz="4" w:space="0" w:color="596B3B"/>
+            </w:tcBorders>
           </w:tcPr>
           <w:p>
+            <w:pPr>
+              <w:spacing w:before="40" w:after="20"/>
+              <w:ind w:left="113"/>
+            </w:pPr>
             <w:r>
               <w:rPr>
                 <w:b/>
                 <w:i w:val="0"/>
                 <w:sz w:val="18"/>
+                <w:u w:val="none"/>
               </w:rPr>
               <w:t>Tasks:</w:t>
             </w:r>
@@ -1398,11 +2048,20 @@
       <w:tr>
         <w:tc>
           <w:tcPr>
-            <w:tcW w:type="dxa" w:w="8787"/>
+            <w:tcW w:type="dxa" w:w="8674"/>
             <w:gridSpan w:val="2"/>
+            <w:tcBorders>
+              <w:top w:val="single" w:sz="4" w:space="0" w:color="596B3B"/>
+              <w:left w:val="single" w:sz="4" w:space="0" w:color="596B3B"/>
+              <w:bottom w:val="single" w:sz="4" w:space="0" w:color="596B3B"/>
+              <w:right w:val="single" w:sz="4" w:space="0" w:color="596B3B"/>
+              <w:insideH w:val="single" w:sz="4" w:space="0" w:color="596B3B"/>
+              <w:insideV w:val="single" w:sz="4" w:space="0" w:color="596B3B"/>
+            </w:tcBorders>
           </w:tcPr>
           <w:p>
             <w:pPr>
+              <w:spacing w:before="20" w:after="20"/>
               <w:ind w:left="283"/>
             </w:pPr>
             <w:r>
@@ -1410,6 +2069,7 @@
                 <w:b w:val="0"/>
                 <w:i w:val="0"/>
                 <w:sz w:val="18"/>
+                <w:u w:val="none"/>
               </w:rPr>
               <w:t>• Admin can generate monthly appointment activity reports.</w:t>
             </w:r>
@@ -1419,11 +2079,20 @@
       <w:tr>
         <w:tc>
           <w:tcPr>
-            <w:tcW w:type="dxa" w:w="8787"/>
+            <w:tcW w:type="dxa" w:w="8674"/>
             <w:gridSpan w:val="2"/>
+            <w:tcBorders>
+              <w:top w:val="single" w:sz="4" w:space="0" w:color="596B3B"/>
+              <w:left w:val="single" w:sz="4" w:space="0" w:color="596B3B"/>
+              <w:bottom w:val="single" w:sz="4" w:space="0" w:color="596B3B"/>
+              <w:right w:val="single" w:sz="4" w:space="0" w:color="596B3B"/>
+              <w:insideH w:val="single" w:sz="4" w:space="0" w:color="596B3B"/>
+              <w:insideV w:val="single" w:sz="4" w:space="0" w:color="596B3B"/>
+            </w:tcBorders>
           </w:tcPr>
           <w:p>
             <w:pPr>
+              <w:spacing w:before="20" w:after="20"/>
               <w:ind w:left="283"/>
             </w:pPr>
             <w:r>
@@ -1431,6 +2100,7 @@
                 <w:b w:val="0"/>
                 <w:i w:val="0"/>
                 <w:sz w:val="18"/>
+                <w:u w:val="none"/>
               </w:rPr>
               <w:t>• Reports display aggregated counts and status breakdowns.</w:t>
             </w:r>
@@ -1440,11 +2110,20 @@
       <w:tr>
         <w:tc>
           <w:tcPr>
-            <w:tcW w:type="dxa" w:w="1984"/>
-            <w:shd w:val="clear" w:color="auto" w:fill="70AD47"/>
+            <w:tcW w:type="dxa" w:w="2154"/>
+            <w:shd w:val="clear" w:color="auto" w:fill="7F9443"/>
+            <w:tcBorders>
+              <w:top w:val="single" w:sz="4" w:space="0" w:color="596B3B"/>
+              <w:left w:val="single" w:sz="4" w:space="0" w:color="596B3B"/>
+              <w:bottom w:val="single" w:sz="4" w:space="0" w:color="596B3B"/>
+              <w:right w:val="single" w:sz="4" w:space="0" w:color="596B3B"/>
+              <w:insideH w:val="single" w:sz="4" w:space="0" w:color="596B3B"/>
+              <w:insideV w:val="single" w:sz="4" w:space="0" w:color="596B3B"/>
+            </w:tcBorders>
           </w:tcPr>
           <w:p>
             <w:pPr>
+              <w:spacing w:before="40" w:after="40"/>
               <w:jc w:val="center"/>
             </w:pPr>
             <w:r>
@@ -1453,6 +2132,7 @@
                 <w:i w:val="0"/>
                 <w:color w:val="FFFFFF"/>
                 <w:sz w:val="18"/>
+                <w:u w:val="none"/>
               </w:rPr>
               <w:t>Appointment</w:t>
               <w:br/>
@@ -1466,11 +2146,20 @@
         </w:tc>
         <w:tc>
           <w:tcPr>
-            <w:tcW w:type="dxa" w:w="6803"/>
-            <w:shd w:val="clear" w:color="auto" w:fill="70AD47"/>
+            <w:tcW w:type="dxa" w:w="6520"/>
+            <w:shd w:val="clear" w:color="auto" w:fill="7F9443"/>
+            <w:tcBorders>
+              <w:top w:val="single" w:sz="4" w:space="0" w:color="596B3B"/>
+              <w:left w:val="single" w:sz="4" w:space="0" w:color="596B3B"/>
+              <w:bottom w:val="single" w:sz="4" w:space="0" w:color="596B3B"/>
+              <w:right w:val="single" w:sz="4" w:space="0" w:color="596B3B"/>
+              <w:insideH w:val="single" w:sz="4" w:space="0" w:color="596B3B"/>
+              <w:insideV w:val="single" w:sz="4" w:space="0" w:color="596B3B"/>
+            </w:tcBorders>
           </w:tcPr>
           <w:p>
             <w:pPr>
+              <w:spacing w:before="40" w:after="40"/>
               <w:jc w:val="both"/>
             </w:pPr>
             <w:r>
@@ -1479,6 +2168,7 @@
                 <w:i w:val="0"/>
                 <w:color w:val="FFFFFF"/>
                 <w:sz w:val="18"/>
+                <w:u w:val="none"/>
               </w:rPr>
               <w:t xml:space="preserve">User Story: </w:t>
             </w:r>
@@ -1488,6 +2178,7 @@
                 <w:i w:val="0"/>
                 <w:color w:val="FFFFFF"/>
                 <w:sz w:val="18"/>
+                <w:u w:val="none"/>
               </w:rPr>
               <w:t>As an admin, I want exportable appointment history with filters so that audits and reviews are easier.</w:t>
             </w:r>
@@ -1497,15 +2188,28 @@
       <w:tr>
         <w:tc>
           <w:tcPr>
-            <w:tcW w:type="dxa" w:w="8787"/>
+            <w:tcW w:type="dxa" w:w="8674"/>
             <w:gridSpan w:val="2"/>
+            <w:tcBorders>
+              <w:top w:val="single" w:sz="4" w:space="0" w:color="596B3B"/>
+              <w:left w:val="single" w:sz="4" w:space="0" w:color="596B3B"/>
+              <w:bottom w:val="single" w:sz="4" w:space="0" w:color="596B3B"/>
+              <w:right w:val="single" w:sz="4" w:space="0" w:color="596B3B"/>
+              <w:insideH w:val="single" w:sz="4" w:space="0" w:color="596B3B"/>
+              <w:insideV w:val="single" w:sz="4" w:space="0" w:color="596B3B"/>
+            </w:tcBorders>
           </w:tcPr>
           <w:p>
+            <w:pPr>
+              <w:spacing w:before="40" w:after="20"/>
+              <w:ind w:left="113"/>
+            </w:pPr>
             <w:r>
               <w:rPr>
                 <w:b/>
                 <w:i w:val="0"/>
                 <w:sz w:val="18"/>
+                <w:u w:val="none"/>
               </w:rPr>
               <w:t>Tasks:</w:t>
             </w:r>
@@ -1515,11 +2219,20 @@
       <w:tr>
         <w:tc>
           <w:tcPr>
-            <w:tcW w:type="dxa" w:w="8787"/>
+            <w:tcW w:type="dxa" w:w="8674"/>
             <w:gridSpan w:val="2"/>
+            <w:tcBorders>
+              <w:top w:val="single" w:sz="4" w:space="0" w:color="596B3B"/>
+              <w:left w:val="single" w:sz="4" w:space="0" w:color="596B3B"/>
+              <w:bottom w:val="single" w:sz="4" w:space="0" w:color="596B3B"/>
+              <w:right w:val="single" w:sz="4" w:space="0" w:color="596B3B"/>
+              <w:insideH w:val="single" w:sz="4" w:space="0" w:color="596B3B"/>
+              <w:insideV w:val="single" w:sz="4" w:space="0" w:color="596B3B"/>
+            </w:tcBorders>
           </w:tcPr>
           <w:p>
             <w:pPr>
+              <w:spacing w:before="20" w:after="20"/>
               <w:ind w:left="283"/>
             </w:pPr>
             <w:r>
@@ -1527,6 +2240,7 @@
                 <w:b w:val="0"/>
                 <w:i w:val="0"/>
                 <w:sz w:val="18"/>
+                <w:u w:val="none"/>
               </w:rPr>
               <w:t>• Admin can filter appointment history by date range and status.</w:t>
             </w:r>
@@ -1536,11 +2250,20 @@
       <w:tr>
         <w:tc>
           <w:tcPr>
-            <w:tcW w:type="dxa" w:w="8787"/>
+            <w:tcW w:type="dxa" w:w="8674"/>
             <w:gridSpan w:val="2"/>
+            <w:tcBorders>
+              <w:top w:val="single" w:sz="4" w:space="0" w:color="596B3B"/>
+              <w:left w:val="single" w:sz="4" w:space="0" w:color="596B3B"/>
+              <w:bottom w:val="single" w:sz="4" w:space="0" w:color="596B3B"/>
+              <w:right w:val="single" w:sz="4" w:space="0" w:color="596B3B"/>
+              <w:insideH w:val="single" w:sz="4" w:space="0" w:color="596B3B"/>
+              <w:insideV w:val="single" w:sz="4" w:space="0" w:color="596B3B"/>
+            </w:tcBorders>
           </w:tcPr>
           <w:p>
             <w:pPr>
+              <w:spacing w:before="20" w:after="20"/>
               <w:ind w:left="283"/>
             </w:pPr>
             <w:r>
@@ -1548,6 +2271,7 @@
                 <w:b w:val="0"/>
                 <w:i w:val="0"/>
                 <w:sz w:val="18"/>
+                <w:u w:val="none"/>
               </w:rPr>
               <w:t>• Admin can export filtered records (CSV/PDF).</w:t>
             </w:r>
@@ -1557,11 +2281,20 @@
       <w:tr>
         <w:tc>
           <w:tcPr>
-            <w:tcW w:type="dxa" w:w="1984"/>
-            <w:shd w:val="clear" w:color="auto" w:fill="70AD47"/>
+            <w:tcW w:type="dxa" w:w="2154"/>
+            <w:shd w:val="clear" w:color="auto" w:fill="7F9443"/>
+            <w:tcBorders>
+              <w:top w:val="single" w:sz="4" w:space="0" w:color="596B3B"/>
+              <w:left w:val="single" w:sz="4" w:space="0" w:color="596B3B"/>
+              <w:bottom w:val="single" w:sz="4" w:space="0" w:color="596B3B"/>
+              <w:right w:val="single" w:sz="4" w:space="0" w:color="596B3B"/>
+              <w:insideH w:val="single" w:sz="4" w:space="0" w:color="596B3B"/>
+              <w:insideV w:val="single" w:sz="4" w:space="0" w:color="596B3B"/>
+            </w:tcBorders>
           </w:tcPr>
           <w:p>
             <w:pPr>
+              <w:spacing w:before="40" w:after="40"/>
               <w:jc w:val="center"/>
             </w:pPr>
             <w:r>
@@ -1570,6 +2303,376 @@
                 <w:i w:val="0"/>
                 <w:color w:val="FFFFFF"/>
                 <w:sz w:val="18"/>
+                <w:u w:val="none"/>
+              </w:rPr>
+              <w:t>Notification</w:t>
+              <w:br/>
+              <w:t>Preferences</w:t>
+              <w:br/>
+              <w:t>(Planned)</w:t>
+            </w:r>
+          </w:p>
+        </w:tc>
+        <w:tc>
+          <w:tcPr>
+            <w:tcW w:type="dxa" w:w="6520"/>
+            <w:shd w:val="clear" w:color="auto" w:fill="7F9443"/>
+            <w:tcBorders>
+              <w:top w:val="single" w:sz="4" w:space="0" w:color="596B3B"/>
+              <w:left w:val="single" w:sz="4" w:space="0" w:color="596B3B"/>
+              <w:bottom w:val="single" w:sz="4" w:space="0" w:color="596B3B"/>
+              <w:right w:val="single" w:sz="4" w:space="0" w:color="596B3B"/>
+              <w:insideH w:val="single" w:sz="4" w:space="0" w:color="596B3B"/>
+              <w:insideV w:val="single" w:sz="4" w:space="0" w:color="596B3B"/>
+            </w:tcBorders>
+          </w:tcPr>
+          <w:p>
+            <w:pPr>
+              <w:spacing w:before="40" w:after="40"/>
+              <w:jc w:val="both"/>
+            </w:pPr>
+            <w:r>
+              <w:rPr>
+                <w:b/>
+                <w:i w:val="0"/>
+                <w:color w:val="FFFFFF"/>
+                <w:sz w:val="18"/>
+                <w:u w:val="none"/>
+              </w:rPr>
+              <w:t xml:space="preserve">User Story: </w:t>
+            </w:r>
+            <w:r>
+              <w:rPr>
+                <w:b w:val="0"/>
+                <w:i w:val="0"/>
+                <w:color w:val="FFFFFF"/>
+                <w:sz w:val="18"/>
+                <w:u w:val="none"/>
+              </w:rPr>
+              <w:t>As a user, I want notification channel preferences so that I receive alerts in my preferred way.</w:t>
+            </w:r>
+          </w:p>
+        </w:tc>
+      </w:tr>
+      <w:tr>
+        <w:tc>
+          <w:tcPr>
+            <w:tcW w:type="dxa" w:w="8674"/>
+            <w:gridSpan w:val="2"/>
+            <w:tcBorders>
+              <w:top w:val="single" w:sz="4" w:space="0" w:color="596B3B"/>
+              <w:left w:val="single" w:sz="4" w:space="0" w:color="596B3B"/>
+              <w:bottom w:val="single" w:sz="4" w:space="0" w:color="596B3B"/>
+              <w:right w:val="single" w:sz="4" w:space="0" w:color="596B3B"/>
+              <w:insideH w:val="single" w:sz="4" w:space="0" w:color="596B3B"/>
+              <w:insideV w:val="single" w:sz="4" w:space="0" w:color="596B3B"/>
+            </w:tcBorders>
+          </w:tcPr>
+          <w:p>
+            <w:pPr>
+              <w:spacing w:before="40" w:after="20"/>
+              <w:ind w:left="113"/>
+            </w:pPr>
+            <w:r>
+              <w:rPr>
+                <w:b/>
+                <w:i w:val="0"/>
+                <w:sz w:val="18"/>
+                <w:u w:val="none"/>
+              </w:rPr>
+              <w:t>Tasks:</w:t>
+            </w:r>
+          </w:p>
+        </w:tc>
+      </w:tr>
+      <w:tr>
+        <w:tc>
+          <w:tcPr>
+            <w:tcW w:type="dxa" w:w="8674"/>
+            <w:gridSpan w:val="2"/>
+            <w:tcBorders>
+              <w:top w:val="single" w:sz="4" w:space="0" w:color="596B3B"/>
+              <w:left w:val="single" w:sz="4" w:space="0" w:color="596B3B"/>
+              <w:bottom w:val="single" w:sz="4" w:space="0" w:color="596B3B"/>
+              <w:right w:val="single" w:sz="4" w:space="0" w:color="596B3B"/>
+              <w:insideH w:val="single" w:sz="4" w:space="0" w:color="596B3B"/>
+              <w:insideV w:val="single" w:sz="4" w:space="0" w:color="596B3B"/>
+            </w:tcBorders>
+          </w:tcPr>
+          <w:p>
+            <w:pPr>
+              <w:spacing w:before="20" w:after="20"/>
+              <w:ind w:left="283"/>
+            </w:pPr>
+            <w:r>
+              <w:rPr>
+                <w:b w:val="0"/>
+                <w:i w:val="0"/>
+                <w:sz w:val="18"/>
+                <w:u w:val="none"/>
+              </w:rPr>
+              <w:t>• Users can configure preferred notification channels (in-app, email, SMS).</w:t>
+            </w:r>
+          </w:p>
+        </w:tc>
+      </w:tr>
+      <w:tr>
+        <w:tc>
+          <w:tcPr>
+            <w:tcW w:type="dxa" w:w="8674"/>
+            <w:gridSpan w:val="2"/>
+            <w:tcBorders>
+              <w:top w:val="single" w:sz="4" w:space="0" w:color="596B3B"/>
+              <w:left w:val="single" w:sz="4" w:space="0" w:color="596B3B"/>
+              <w:bottom w:val="single" w:sz="4" w:space="0" w:color="596B3B"/>
+              <w:right w:val="single" w:sz="4" w:space="0" w:color="596B3B"/>
+              <w:insideH w:val="single" w:sz="4" w:space="0" w:color="596B3B"/>
+              <w:insideV w:val="single" w:sz="4" w:space="0" w:color="596B3B"/>
+            </w:tcBorders>
+          </w:tcPr>
+          <w:p>
+            <w:pPr>
+              <w:spacing w:before="20" w:after="20"/>
+              <w:ind w:left="283"/>
+            </w:pPr>
+            <w:r>
+              <w:rPr>
+                <w:b w:val="0"/>
+                <w:i w:val="0"/>
+                <w:sz w:val="18"/>
+                <w:u w:val="none"/>
+              </w:rPr>
+              <w:t>• Preferences are saved per user account.</w:t>
+            </w:r>
+          </w:p>
+        </w:tc>
+      </w:tr>
+      <w:tr>
+        <w:tc>
+          <w:tcPr>
+            <w:tcW w:type="dxa" w:w="2154"/>
+            <w:shd w:val="clear" w:color="auto" w:fill="7F9443"/>
+            <w:tcBorders>
+              <w:top w:val="single" w:sz="4" w:space="0" w:color="596B3B"/>
+              <w:left w:val="single" w:sz="4" w:space="0" w:color="596B3B"/>
+              <w:bottom w:val="single" w:sz="4" w:space="0" w:color="596B3B"/>
+              <w:right w:val="single" w:sz="4" w:space="0" w:color="596B3B"/>
+              <w:insideH w:val="single" w:sz="4" w:space="0" w:color="596B3B"/>
+              <w:insideV w:val="single" w:sz="4" w:space="0" w:color="596B3B"/>
+            </w:tcBorders>
+          </w:tcPr>
+          <w:p>
+            <w:pPr>
+              <w:spacing w:before="40" w:after="40"/>
+              <w:jc w:val="center"/>
+            </w:pPr>
+            <w:r>
+              <w:rPr>
+                <w:b/>
+                <w:i w:val="0"/>
+                <w:color w:val="FFFFFF"/>
+                <w:sz w:val="18"/>
+                <w:u w:val="none"/>
+              </w:rPr>
+              <w:t>Security</w:t>
+              <w:br/>
+              <w:t>Hardening</w:t>
+              <w:br/>
+              <w:t>(Planned)</w:t>
+            </w:r>
+          </w:p>
+        </w:tc>
+        <w:tc>
+          <w:tcPr>
+            <w:tcW w:type="dxa" w:w="6520"/>
+            <w:shd w:val="clear" w:color="auto" w:fill="7F9443"/>
+            <w:tcBorders>
+              <w:top w:val="single" w:sz="4" w:space="0" w:color="596B3B"/>
+              <w:left w:val="single" w:sz="4" w:space="0" w:color="596B3B"/>
+              <w:bottom w:val="single" w:sz="4" w:space="0" w:color="596B3B"/>
+              <w:right w:val="single" w:sz="4" w:space="0" w:color="596B3B"/>
+              <w:insideH w:val="single" w:sz="4" w:space="0" w:color="596B3B"/>
+              <w:insideV w:val="single" w:sz="4" w:space="0" w:color="596B3B"/>
+            </w:tcBorders>
+          </w:tcPr>
+          <w:p>
+            <w:pPr>
+              <w:spacing w:before="40" w:after="40"/>
+              <w:jc w:val="both"/>
+            </w:pPr>
+            <w:r>
+              <w:rPr>
+                <w:b/>
+                <w:i w:val="0"/>
+                <w:color w:val="FFFFFF"/>
+                <w:sz w:val="18"/>
+                <w:u w:val="none"/>
+              </w:rPr>
+              <w:t xml:space="preserve">User Story: </w:t>
+            </w:r>
+            <w:r>
+              <w:rPr>
+                <w:b w:val="0"/>
+                <w:i w:val="0"/>
+                <w:color w:val="FFFFFF"/>
+                <w:sz w:val="18"/>
+                <w:u w:val="none"/>
+              </w:rPr>
+              <w:t>As a system owner, I want stronger session and security controls so that the platform remains protected.</w:t>
+            </w:r>
+          </w:p>
+        </w:tc>
+      </w:tr>
+      <w:tr>
+        <w:tc>
+          <w:tcPr>
+            <w:tcW w:type="dxa" w:w="8674"/>
+            <w:gridSpan w:val="2"/>
+            <w:tcBorders>
+              <w:top w:val="single" w:sz="4" w:space="0" w:color="596B3B"/>
+              <w:left w:val="single" w:sz="4" w:space="0" w:color="596B3B"/>
+              <w:bottom w:val="single" w:sz="4" w:space="0" w:color="596B3B"/>
+              <w:right w:val="single" w:sz="4" w:space="0" w:color="596B3B"/>
+              <w:insideH w:val="single" w:sz="4" w:space="0" w:color="596B3B"/>
+              <w:insideV w:val="single" w:sz="4" w:space="0" w:color="596B3B"/>
+            </w:tcBorders>
+          </w:tcPr>
+          <w:p>
+            <w:pPr>
+              <w:spacing w:before="40" w:after="20"/>
+              <w:ind w:left="113"/>
+            </w:pPr>
+            <w:r>
+              <w:rPr>
+                <w:b/>
+                <w:i w:val="0"/>
+                <w:sz w:val="18"/>
+                <w:u w:val="none"/>
+              </w:rPr>
+              <w:t>Tasks:</w:t>
+            </w:r>
+          </w:p>
+        </w:tc>
+      </w:tr>
+      <w:tr>
+        <w:tc>
+          <w:tcPr>
+            <w:tcW w:type="dxa" w:w="8674"/>
+            <w:gridSpan w:val="2"/>
+            <w:tcBorders>
+              <w:top w:val="single" w:sz="4" w:space="0" w:color="596B3B"/>
+              <w:left w:val="single" w:sz="4" w:space="0" w:color="596B3B"/>
+              <w:bottom w:val="single" w:sz="4" w:space="0" w:color="596B3B"/>
+              <w:right w:val="single" w:sz="4" w:space="0" w:color="596B3B"/>
+              <w:insideH w:val="single" w:sz="4" w:space="0" w:color="596B3B"/>
+              <w:insideV w:val="single" w:sz="4" w:space="0" w:color="596B3B"/>
+            </w:tcBorders>
+          </w:tcPr>
+          <w:p>
+            <w:pPr>
+              <w:spacing w:before="20" w:after="20"/>
+              <w:ind w:left="283"/>
+            </w:pPr>
+            <w:r>
+              <w:rPr>
+                <w:b w:val="0"/>
+                <w:i w:val="0"/>
+                <w:sz w:val="18"/>
+                <w:u w:val="none"/>
+              </w:rPr>
+              <w:t>• Rate limiting on authentication endpoints.</w:t>
+            </w:r>
+          </w:p>
+        </w:tc>
+      </w:tr>
+      <w:tr>
+        <w:tc>
+          <w:tcPr>
+            <w:tcW w:type="dxa" w:w="8674"/>
+            <w:gridSpan w:val="2"/>
+            <w:tcBorders>
+              <w:top w:val="single" w:sz="4" w:space="0" w:color="596B3B"/>
+              <w:left w:val="single" w:sz="4" w:space="0" w:color="596B3B"/>
+              <w:bottom w:val="single" w:sz="4" w:space="0" w:color="596B3B"/>
+              <w:right w:val="single" w:sz="4" w:space="0" w:color="596B3B"/>
+              <w:insideH w:val="single" w:sz="4" w:space="0" w:color="596B3B"/>
+              <w:insideV w:val="single" w:sz="4" w:space="0" w:color="596B3B"/>
+            </w:tcBorders>
+          </w:tcPr>
+          <w:p>
+            <w:pPr>
+              <w:spacing w:before="20" w:after="20"/>
+              <w:ind w:left="283"/>
+            </w:pPr>
+            <w:r>
+              <w:rPr>
+                <w:b w:val="0"/>
+                <w:i w:val="0"/>
+                <w:sz w:val="18"/>
+                <w:u w:val="none"/>
+              </w:rPr>
+              <w:t>• Enhanced audit logging for administrative actions.</w:t>
+            </w:r>
+          </w:p>
+        </w:tc>
+      </w:tr>
+      <w:tr>
+        <w:tc>
+          <w:tcPr>
+            <w:tcW w:type="dxa" w:w="8674"/>
+            <w:gridSpan w:val="2"/>
+            <w:tcBorders>
+              <w:top w:val="single" w:sz="4" w:space="0" w:color="596B3B"/>
+              <w:left w:val="single" w:sz="4" w:space="0" w:color="596B3B"/>
+              <w:bottom w:val="single" w:sz="4" w:space="0" w:color="596B3B"/>
+              <w:right w:val="single" w:sz="4" w:space="0" w:color="596B3B"/>
+              <w:insideH w:val="single" w:sz="4" w:space="0" w:color="596B3B"/>
+              <w:insideV w:val="single" w:sz="4" w:space="0" w:color="596B3B"/>
+            </w:tcBorders>
+          </w:tcPr>
+          <w:p>
+            <w:pPr>
+              <w:spacing w:before="20" w:after="20"/>
+              <w:ind w:left="283"/>
+            </w:pPr>
+            <w:r>
+              <w:rPr>
+                <w:b w:val="0"/>
+                <w:i w:val="0"/>
+                <w:sz w:val="18"/>
+                <w:u w:val="none"/>
+              </w:rPr>
+              <w:t>• Stronger session timeout and CSRF enforcement.</w:t>
+            </w:r>
+          </w:p>
+        </w:tc>
+      </w:tr>
+      <w:tr>
+        <w:tc>
+          <w:tcPr>
+            <w:tcW w:type="dxa" w:w="2154"/>
+            <w:shd w:val="clear" w:color="auto" w:fill="7F9443"/>
+            <w:tcBorders>
+              <w:top w:val="single" w:sz="4" w:space="0" w:color="596B3B"/>
+              <w:left w:val="single" w:sz="4" w:space="0" w:color="596B3B"/>
+              <w:bottom w:val="single" w:sz="4" w:space="0" w:color="596B3B"/>
+              <w:right w:val="single" w:sz="4" w:space="0" w:color="596B3B"/>
+              <w:insideH w:val="single" w:sz="4" w:space="0" w:color="596B3B"/>
+              <w:insideV w:val="single" w:sz="4" w:space="0" w:color="596B3B"/>
+            </w:tcBorders>
+          </w:tcPr>
+          <w:p>
+            <w:pPr>
+              <w:spacing w:before="40" w:after="40"/>
+              <w:jc w:val="center"/>
+            </w:pPr>
+            <w:r>
+              <w:rPr>
+                <w:b/>
+                <w:i w:val="0"/>
+                <w:color w:val="FFFFFF"/>
+                <w:sz w:val="18"/>
+                <w:u w:val="none"/>
               </w:rPr>
               <w:t>Analytics</w:t>
               <w:br/>
@@ -1581,11 +2684,20 @@
         </w:tc>
         <w:tc>
           <w:tcPr>
-            <w:tcW w:type="dxa" w:w="6803"/>
-            <w:shd w:val="clear" w:color="auto" w:fill="70AD47"/>
+            <w:tcW w:type="dxa" w:w="6520"/>
+            <w:shd w:val="clear" w:color="auto" w:fill="7F9443"/>
+            <w:tcBorders>
+              <w:top w:val="single" w:sz="4" w:space="0" w:color="596B3B"/>
+              <w:left w:val="single" w:sz="4" w:space="0" w:color="596B3B"/>
+              <w:bottom w:val="single" w:sz="4" w:space="0" w:color="596B3B"/>
+              <w:right w:val="single" w:sz="4" w:space="0" w:color="596B3B"/>
+              <w:insideH w:val="single" w:sz="4" w:space="0" w:color="596B3B"/>
+              <w:insideV w:val="single" w:sz="4" w:space="0" w:color="596B3B"/>
+            </w:tcBorders>
           </w:tcPr>
           <w:p>
             <w:pPr>
+              <w:spacing w:before="40" w:after="40"/>
               <w:jc w:val="both"/>
             </w:pPr>
             <w:r>
@@ -1594,6 +2706,7 @@
                 <w:i w:val="0"/>
                 <w:color w:val="FFFFFF"/>
                 <w:sz w:val="18"/>
+                <w:u w:val="none"/>
               </w:rPr>
               <w:t xml:space="preserve">User Story: </w:t>
             </w:r>
@@ -1603,8 +2716,9 @@
                 <w:i w:val="0"/>
                 <w:color w:val="FFFFFF"/>
                 <w:sz w:val="18"/>
+                <w:u w:val="none"/>
               </w:rPr>
-              <w:t>As management, I want KPI cards and trend charts so that performance can be tracked at a glance.</w:t>
+              <w:t>As management, I want KPI cards and trend charts so that performance can be tracked quickly.</w:t>
             </w:r>
           </w:p>
         </w:tc>
@@ -1612,15 +2726,28 @@
       <w:tr>
         <w:tc>
           <w:tcPr>
-            <w:tcW w:type="dxa" w:w="8787"/>
+            <w:tcW w:type="dxa" w:w="8674"/>
             <w:gridSpan w:val="2"/>
+            <w:tcBorders>
+              <w:top w:val="single" w:sz="4" w:space="0" w:color="596B3B"/>
+              <w:left w:val="single" w:sz="4" w:space="0" w:color="596B3B"/>
+              <w:bottom w:val="single" w:sz="4" w:space="0" w:color="596B3B"/>
+              <w:right w:val="single" w:sz="4" w:space="0" w:color="596B3B"/>
+              <w:insideH w:val="single" w:sz="4" w:space="0" w:color="596B3B"/>
+              <w:insideV w:val="single" w:sz="4" w:space="0" w:color="596B3B"/>
+            </w:tcBorders>
           </w:tcPr>
           <w:p>
+            <w:pPr>
+              <w:spacing w:before="40" w:after="20"/>
+              <w:ind w:left="113"/>
+            </w:pPr>
             <w:r>
               <w:rPr>
                 <w:b/>
                 <w:i w:val="0"/>
                 <w:sz w:val="18"/>
+                <w:u w:val="none"/>
               </w:rPr>
               <w:t>Tasks:</w:t>
             </w:r>
@@ -1630,11 +2757,20 @@
       <w:tr>
         <w:tc>
           <w:tcPr>
-            <w:tcW w:type="dxa" w:w="8787"/>
+            <w:tcW w:type="dxa" w:w="8674"/>
             <w:gridSpan w:val="2"/>
+            <w:tcBorders>
+              <w:top w:val="single" w:sz="4" w:space="0" w:color="596B3B"/>
+              <w:left w:val="single" w:sz="4" w:space="0" w:color="596B3B"/>
+              <w:bottom w:val="single" w:sz="4" w:space="0" w:color="596B3B"/>
+              <w:right w:val="single" w:sz="4" w:space="0" w:color="596B3B"/>
+              <w:insideH w:val="single" w:sz="4" w:space="0" w:color="596B3B"/>
+              <w:insideV w:val="single" w:sz="4" w:space="0" w:color="596B3B"/>
+            </w:tcBorders>
           </w:tcPr>
           <w:p>
             <w:pPr>
+              <w:spacing w:before="20" w:after="20"/>
               <w:ind w:left="283"/>
             </w:pPr>
             <w:r>
@@ -1642,8 +2778,9 @@
                 <w:b w:val="0"/>
                 <w:i w:val="0"/>
                 <w:sz w:val="18"/>
+                <w:u w:val="none"/>
               </w:rPr>
-              <w:t>• Dashboard displays KPI summary cards (total appointments, completions, declines).</w:t>
+              <w:t>• Dashboard displays KPI cards (total appointments, completions, declines).</w:t>
             </w:r>
           </w:p>
         </w:tc>
@@ -1651,11 +2788,20 @@
       <w:tr>
         <w:tc>
           <w:tcPr>
-            <w:tcW w:type="dxa" w:w="8787"/>
+            <w:tcW w:type="dxa" w:w="8674"/>
             <w:gridSpan w:val="2"/>
+            <w:tcBorders>
+              <w:top w:val="single" w:sz="4" w:space="0" w:color="596B3B"/>
+              <w:left w:val="single" w:sz="4" w:space="0" w:color="596B3B"/>
+              <w:bottom w:val="single" w:sz="4" w:space="0" w:color="596B3B"/>
+              <w:right w:val="single" w:sz="4" w:space="0" w:color="596B3B"/>
+              <w:insideH w:val="single" w:sz="4" w:space="0" w:color="596B3B"/>
+              <w:insideV w:val="single" w:sz="4" w:space="0" w:color="596B3B"/>
+            </w:tcBorders>
           </w:tcPr>
           <w:p>
             <w:pPr>
+              <w:spacing w:before="20" w:after="20"/>
               <w:ind w:left="283"/>
             </w:pPr>
             <w:r>
@@ -1663,8 +2809,40 @@
                 <w:b w:val="0"/>
                 <w:i w:val="0"/>
                 <w:sz w:val="18"/>
+                <w:u w:val="none"/>
               </w:rPr>
               <w:t>• Trend charts show activity over selectable time ranges.</w:t>
+            </w:r>
+          </w:p>
+        </w:tc>
+      </w:tr>
+      <w:tr>
+        <w:tc>
+          <w:tcPr>
+            <w:tcW w:type="dxa" w:w="8674"/>
+            <w:gridSpan w:val="2"/>
+            <w:tcBorders>
+              <w:top w:val="single" w:sz="4" w:space="0" w:color="596B3B"/>
+              <w:left w:val="single" w:sz="4" w:space="0" w:color="596B3B"/>
+              <w:bottom w:val="single" w:sz="4" w:space="0" w:color="596B3B"/>
+              <w:right w:val="single" w:sz="4" w:space="0" w:color="596B3B"/>
+              <w:insideH w:val="single" w:sz="4" w:space="0" w:color="596B3B"/>
+              <w:insideV w:val="single" w:sz="4" w:space="0" w:color="596B3B"/>
+            </w:tcBorders>
+          </w:tcPr>
+          <w:p>
+            <w:pPr>
+              <w:spacing w:before="20" w:after="20"/>
+              <w:ind w:left="283"/>
+            </w:pPr>
+            <w:r>
+              <w:rPr>
+                <w:b w:val="0"/>
+                <w:i w:val="0"/>
+                <w:sz w:val="18"/>
+                <w:u w:val="none"/>
+              </w:rPr>
+              <w:t>• Charts are filterable by date range and role.</w:t>
             </w:r>
           </w:p>
         </w:tc>
@@ -1679,9 +2857,14 @@
     <w:p>
       <w:pPr>
         <w:pStyle w:val="Heading1"/>
-        <w:jc w:val="left"/>
       </w:pPr>
       <w:r>
+        <w:rPr>
+          <w:b/>
+          <w:i w:val="0"/>
+          <w:sz w:val="28"/>
+          <w:u w:val="none"/>
+        </w:rPr>
         <w:t>Appendix D</w:t>
       </w:r>
     </w:p>
@@ -1691,7 +2874,11 @@
       </w:pPr>
       <w:r>
         <w:rPr>
+          <w:b/>
+          <w:i w:val="0"/>
           <w:color w:val="FF0000"/>
+          <w:sz w:val="26"/>
+          <w:u w:val="single"/>
         </w:rPr>
         <w:t>Release Notes</w:t>
       </w:r>
@@ -1701,8 +2888,10 @@
         <w:rPr>
           <w:b/>
           <w:i w:val="0"/>
+          <w:sz w:val="22"/>
+          <w:u w:val="none"/>
         </w:rPr>
-        <w:t>Medy-Care: Healthcare Clinic Management System — Release Notes</w:t>
+        <w:t>Medy-Care: Web-Based Healthcare Clinic Management System — Release Notes</w:t>
       </w:r>
     </w:p>
     <w:p>
@@ -1710,7 +2899,23 @@
         <w:pStyle w:val="Heading3"/>
       </w:pPr>
       <w:r>
-        <w:t>Version 1.0.0 — Initial Release</w:t>
+        <w:rPr>
+          <w:b/>
+          <w:i w:val="0"/>
+          <w:sz w:val="22"/>
+          <w:u w:val="none"/>
+        </w:rPr>
+        <w:t xml:space="preserve">Version 1.0.0 — Initial </w:t>
+      </w:r>
+      <w:r>
+        <w:rPr>
+          <w:b/>
+          <w:i w:val="0"/>
+          <w:color w:val="FF0000"/>
+          <w:sz w:val="22"/>
+          <w:u w:val="single"/>
+        </w:rPr>
+        <w:t>Release</w:t>
       </w:r>
     </w:p>
     <w:p>
@@ -1718,6 +2923,8 @@
         <w:rPr>
           <w:b/>
           <w:i w:val="0"/>
+          <w:sz w:val="20"/>
+          <w:u w:val="none"/>
         </w:rPr>
         <w:t xml:space="preserve">Release Date: </w:t>
       </w:r>
@@ -1725,6 +2932,8 @@
         <w:rPr>
           <w:b w:val="0"/>
           <w:i w:val="0"/>
+          <w:sz w:val="20"/>
+          <w:u w:val="none"/>
         </w:rPr>
         <w:t>April 16, 2026</w:t>
       </w:r>
@@ -1742,7 +2951,7 @@
         <w:jc w:val="both"/>
       </w:pPr>
       <w:r>
-        <w:t>Medy-Care is a web-based healthcare clinic management platform designed to streamline daily clinic operations, enhance staff accountability, and centralize the management of appointments, clinical records, and guardian communications. This initial release delivers the foundational features required for clinic administrators, nurses, and students to begin managing their operations through a unified and secure system.</w:t>
+        <w:t>Medy-Care is a web-based healthcare clinic management platform designed to streamline daily clinic operations, enhance staff accountability, and centralise the management of appointments, clinical records, and guardian communications. This initial release delivers the foundational features required for clinic administrators, nurses, and students to begin managing their operations through a unified and secure system.</w:t>
       </w:r>
     </w:p>
     <w:p>
@@ -1763,13 +2972,24 @@
     </w:p>
     <w:p>
       <w:pPr>
-        <w:pStyle w:val="ListBullet"/>
+        <w:spacing w:after="80"/>
         <w:jc w:val="both"/>
       </w:pPr>
       <w:r>
         <w:rPr>
           <w:b/>
           <w:i w:val="0"/>
+          <w:sz w:val="20"/>
+          <w:u w:val="none"/>
+        </w:rPr>
+        <w:t xml:space="preserve">✓ </w:t>
+      </w:r>
+      <w:r>
+        <w:rPr>
+          <w:b/>
+          <w:i w:val="0"/>
+          <w:sz w:val="20"/>
+          <w:u w:val="none"/>
         </w:rPr>
         <w:t xml:space="preserve">User Authentication — </w:t>
       </w:r>
@@ -1777,19 +2997,32 @@
         <w:rPr>
           <w:b w:val="0"/>
           <w:i w:val="0"/>
+          <w:sz w:val="20"/>
+          <w:u w:val="none"/>
         </w:rPr>
-        <w:t>Secure login for all user roles using email and password credentials with server-side validation. Includes OTP verification and role-based redirection upon login, directing each user to their designated dashboard upon successful authentication.</w:t>
+        <w:t>Secure login for all user roles using email and password credentials with server-side validation via Laravel. Includes OTP verification and role-based redirection upon login, directing each user to their designated dashboard upon successful authentication.</w:t>
       </w:r>
     </w:p>
     <w:p>
       <w:pPr>
-        <w:pStyle w:val="ListBullet"/>
+        <w:spacing w:after="80"/>
         <w:jc w:val="both"/>
       </w:pPr>
       <w:r>
         <w:rPr>
           <w:b/>
           <w:i w:val="0"/>
+          <w:sz w:val="20"/>
+          <w:u w:val="none"/>
+        </w:rPr>
+        <w:t xml:space="preserve">✓ </w:t>
+      </w:r>
+      <w:r>
+        <w:rPr>
+          <w:b/>
+          <w:i w:val="0"/>
+          <w:sz w:val="20"/>
+          <w:u w:val="none"/>
         </w:rPr>
         <w:t xml:space="preserve">Roles and Permissions — </w:t>
       </w:r>
@@ -1797,19 +3030,32 @@
         <w:rPr>
           <w:b w:val="0"/>
           <w:i w:val="0"/>
+          <w:sz w:val="20"/>
+          <w:u w:val="none"/>
         </w:rPr>
-        <w:t>Role-based access control enforced across three user levels: Admin, Nurse, and Student. Admins can approve or reject new staff registrations and manage user accounts from a centralized dashboard.</w:t>
+        <w:t>Role-based access control enforced across three user levels: Admin, Nurse, and Student. Admins can approve or reject new staff registrations and manage user accounts from a centralised dashboard.</w:t>
       </w:r>
     </w:p>
     <w:p>
       <w:pPr>
-        <w:pStyle w:val="ListBullet"/>
+        <w:spacing w:after="80"/>
         <w:jc w:val="both"/>
       </w:pPr>
       <w:r>
         <w:rPr>
           <w:b/>
           <w:i w:val="0"/>
+          <w:sz w:val="20"/>
+          <w:u w:val="none"/>
+        </w:rPr>
+        <w:t xml:space="preserve">✓ </w:t>
+      </w:r>
+      <w:r>
+        <w:rPr>
+          <w:b/>
+          <w:i w:val="0"/>
+          <w:sz w:val="20"/>
+          <w:u w:val="none"/>
         </w:rPr>
         <w:t xml:space="preserve">Appointment Management — </w:t>
       </w:r>
@@ -1817,39 +3063,65 @@
         <w:rPr>
           <w:b w:val="0"/>
           <w:i w:val="0"/>
+          <w:sz w:val="20"/>
+          <w:u w:val="none"/>
         </w:rPr>
-        <w:t>Students can book, view, and cancel clinic appointments. Nurses manage the appointment queue by starting, completing, or declining sessions. Admins can monitor all, today's, and weekly appointments from their dashboard.</w:t>
+        <w:t>Students can book, view, and cancel clinic appointments. Nurses manage the appointment queue by starting, completing, or declining sessions. Admins monitor all, today's, and weekly appointments from their dashboard.</w:t>
       </w:r>
     </w:p>
     <w:p>
       <w:pPr>
-        <w:pStyle w:val="ListBullet"/>
+        <w:spacing w:after="80"/>
         <w:jc w:val="both"/>
       </w:pPr>
       <w:r>
         <w:rPr>
           <w:b/>
           <w:i w:val="0"/>
+          <w:sz w:val="20"/>
+          <w:u w:val="none"/>
         </w:rPr>
-        <w:t xml:space="preserve">Clinical Operations — </w:t>
+        <w:t xml:space="preserve">✓ </w:t>
+      </w:r>
+      <w:r>
+        <w:rPr>
+          <w:b/>
+          <w:i w:val="0"/>
+          <w:sz w:val="20"/>
+          <w:u w:val="none"/>
+        </w:rPr>
+        <w:t xml:space="preserve">Clinical Records — </w:t>
       </w:r>
       <w:r>
         <w:rPr>
           <w:b w:val="0"/>
           <w:i w:val="0"/>
+          <w:sz w:val="20"/>
+          <w:u w:val="none"/>
         </w:rPr>
         <w:t>Nurses have access to student medical records and can create emergency records for urgent cases. All records are stored with timestamps and accessible through dedicated listing and detail views.</w:t>
       </w:r>
     </w:p>
     <w:p>
       <w:pPr>
-        <w:pStyle w:val="ListBullet"/>
+        <w:spacing w:after="80"/>
         <w:jc w:val="both"/>
       </w:pPr>
       <w:r>
         <w:rPr>
           <w:b/>
           <w:i w:val="0"/>
+          <w:sz w:val="20"/>
+          <w:u w:val="none"/>
+        </w:rPr>
+        <w:t xml:space="preserve">✓ </w:t>
+      </w:r>
+      <w:r>
+        <w:rPr>
+          <w:b/>
+          <w:i w:val="0"/>
+          <w:sz w:val="20"/>
+          <w:u w:val="none"/>
         </w:rPr>
         <w:t xml:space="preserve">Notifications — </w:t>
       </w:r>
@@ -1857,19 +3129,32 @@
         <w:rPr>
           <w:b w:val="0"/>
           <w:i w:val="0"/>
+          <w:sz w:val="20"/>
+          <w:u w:val="none"/>
         </w:rPr>
         <w:t>In-app notification system with real-time unread count badges. Users can mark individual or all notifications as read. Notifications are triggered by appointment events and system actions.</w:t>
       </w:r>
     </w:p>
     <w:p>
       <w:pPr>
-        <w:pStyle w:val="ListBullet"/>
+        <w:spacing w:after="80"/>
         <w:jc w:val="both"/>
       </w:pPr>
       <w:r>
         <w:rPr>
           <w:b/>
           <w:i w:val="0"/>
+          <w:sz w:val="20"/>
+          <w:u w:val="none"/>
+        </w:rPr>
+        <w:t xml:space="preserve">✓ </w:t>
+      </w:r>
+      <w:r>
+        <w:rPr>
+          <w:b/>
+          <w:i w:val="0"/>
+          <w:sz w:val="20"/>
+          <w:u w:val="none"/>
         </w:rPr>
         <w:t xml:space="preserve">Guardian Communication — </w:t>
       </w:r>
@@ -1877,19 +3162,32 @@
         <w:rPr>
           <w:b w:val="0"/>
           <w:i w:val="0"/>
+          <w:sz w:val="20"/>
+          <w:u w:val="none"/>
         </w:rPr>
         <w:t>Clinic staff can send SMS messages to student guardians both manually and through appointment-linked triggers. All sent messages are logged in the Guardian SMS module.</w:t>
       </w:r>
     </w:p>
     <w:p>
       <w:pPr>
-        <w:pStyle w:val="ListBullet"/>
+        <w:spacing w:after="80"/>
         <w:jc w:val="both"/>
       </w:pPr>
       <w:r>
         <w:rPr>
           <w:b/>
           <w:i w:val="0"/>
+          <w:sz w:val="20"/>
+          <w:u w:val="none"/>
+        </w:rPr>
+        <w:t xml:space="preserve">✓ </w:t>
+      </w:r>
+      <w:r>
+        <w:rPr>
+          <w:b/>
+          <w:i w:val="0"/>
+          <w:sz w:val="20"/>
+          <w:u w:val="none"/>
         </w:rPr>
         <w:t xml:space="preserve">Reporting — </w:t>
       </w:r>
@@ -1897,6 +3195,8 @@
         <w:rPr>
           <w:b w:val="0"/>
           <w:i w:val="0"/>
+          <w:sz w:val="20"/>
+          <w:u w:val="none"/>
         </w:rPr>
         <w:t>Monthly report generation for appointment activity, providing administrators with aggregated counts and status breakdowns for oversight and planning.</w:t>
       </w:r>
@@ -1914,6 +3214,12 @@
         <w:pStyle w:val="ListBullet"/>
       </w:pPr>
       <w:r>
+        <w:rPr>
+          <w:b w:val="0"/>
+          <w:i w:val="0"/>
+          <w:sz w:val="20"/>
+          <w:u w:val="none"/>
+        </w:rPr>
         <w:t>Developed using Laravel (PHP) for the backend with Blade templating for the frontend.</w:t>
       </w:r>
     </w:p>
@@ -1922,6 +3228,12 @@
         <w:pStyle w:val="ListBullet"/>
       </w:pPr>
       <w:r>
+        <w:rPr>
+          <w:b w:val="0"/>
+          <w:i w:val="0"/>
+          <w:sz w:val="20"/>
+          <w:u w:val="none"/>
+        </w:rPr>
         <w:t>MySQL database for data storage and management, with Eloquent ORM for secure query handling.</w:t>
       </w:r>
     </w:p>
@@ -1930,6 +3242,12 @@
         <w:pStyle w:val="ListBullet"/>
       </w:pPr>
       <w:r>
+        <w:rPr>
+          <w:b w:val="0"/>
+          <w:i w:val="0"/>
+          <w:sz w:val="20"/>
+          <w:u w:val="none"/>
+        </w:rPr>
         <w:t>Tailwind CSS for responsive and modern UI styling.</w:t>
       </w:r>
     </w:p>
@@ -1938,6 +3256,12 @@
         <w:pStyle w:val="ListBullet"/>
       </w:pPr>
       <w:r>
+        <w:rPr>
+          <w:b w:val="0"/>
+          <w:i w:val="0"/>
+          <w:sz w:val="20"/>
+          <w:u w:val="none"/>
+        </w:rPr>
         <w:t>Role-based route protection with middleware-gated route groups.</w:t>
       </w:r>
     </w:p>
@@ -1946,6 +3270,12 @@
         <w:pStyle w:val="ListBullet"/>
       </w:pPr>
       <w:r>
+        <w:rPr>
+          <w:b w:val="0"/>
+          <w:i w:val="0"/>
+          <w:sz w:val="20"/>
+          <w:u w:val="none"/>
+        </w:rPr>
         <w:t>OTP verification flow for additional authentication security.</w:t>
       </w:r>
     </w:p>
@@ -1960,30 +3290,38 @@
     <w:p>
       <w:pPr>
         <w:pStyle w:val="ListBullet"/>
+        <w:jc w:val="both"/>
       </w:pPr>
       <w:r>
         <w:rPr>
           <w:b/>
-          <w:i/>
+          <w:i w:val="0"/>
+          <w:sz w:val="20"/>
+          <w:u w:val="none"/>
         </w:rPr>
-        <w:t xml:space="preserve">Appointment notifications — </w:t>
+        <w:t xml:space="preserve">Appointment session notifications — </w:t>
       </w:r>
       <w:r>
         <w:rPr>
           <w:b w:val="0"/>
           <w:i w:val="0"/>
+          <w:sz w:val="20"/>
+          <w:u w:val="none"/>
         </w:rPr>
-        <w:t>No automated push/email notification is sent when a nurse starts or completes a session.</w:t>
+        <w:t>No automated push or email notification is sent when a nurse starts or completes a session.</w:t>
       </w:r>
     </w:p>
     <w:p>
       <w:pPr>
         <w:pStyle w:val="ListBullet"/>
+        <w:jc w:val="both"/>
       </w:pPr>
       <w:r>
         <w:rPr>
           <w:b/>
-          <w:i/>
+          <w:i w:val="0"/>
+          <w:sz w:val="20"/>
+          <w:u w:val="none"/>
         </w:rPr>
         <w:t xml:space="preserve">Guardian SMS automation — </w:t>
       </w:r>
@@ -1991,6 +3329,8 @@
         <w:rPr>
           <w:b w:val="0"/>
           <w:i w:val="0"/>
+          <w:sz w:val="20"/>
+          <w:u w:val="none"/>
         </w:rPr>
         <w:t>Appointment-linked SMS triggers may require manual initiation in some edge cases.</w:t>
       </w:r>
@@ -1998,11 +3338,14 @@
     <w:p>
       <w:pPr>
         <w:pStyle w:val="ListBullet"/>
+        <w:jc w:val="both"/>
       </w:pPr>
       <w:r>
         <w:rPr>
           <w:b/>
-          <w:i/>
+          <w:i w:val="0"/>
+          <w:sz w:val="20"/>
+          <w:u w:val="none"/>
         </w:rPr>
         <w:t xml:space="preserve">Report export — </w:t>
       </w:r>
@@ -2010,6 +3353,8 @@
         <w:rPr>
           <w:b w:val="0"/>
           <w:i w:val="0"/>
+          <w:sz w:val="20"/>
+          <w:u w:val="none"/>
         </w:rPr>
         <w:t>Monthly reports are viewable on-screen only; export to PDF or CSV is not yet supported.</w:t>
       </w:r>
@@ -2027,6 +3372,12 @@
         <w:pStyle w:val="ListBullet"/>
       </w:pPr>
       <w:r>
+        <w:rPr>
+          <w:b w:val="0"/>
+          <w:i w:val="0"/>
+          <w:sz w:val="20"/>
+          <w:u w:val="none"/>
+        </w:rPr>
         <w:t>The analytics dashboard is reserved for a future release; only monthly text-based reports are available.</w:t>
       </w:r>
     </w:p>
@@ -2035,6 +3386,12 @@
         <w:pStyle w:val="ListBullet"/>
       </w:pPr>
       <w:r>
+        <w:rPr>
+          <w:b w:val="0"/>
+          <w:i w:val="0"/>
+          <w:sz w:val="20"/>
+          <w:u w:val="none"/>
+        </w:rPr>
         <w:t>Notification channel preferences are not configurable in this version.</w:t>
       </w:r>
     </w:p>
@@ -2043,7 +3400,27 @@
         <w:pStyle w:val="ListBullet"/>
       </w:pPr>
       <w:r>
-        <w:t>Branch or multi-clinic management is not supported; the system operates as a single-clinic instance.</w:t>
+        <w:rPr>
+          <w:b w:val="0"/>
+          <w:i w:val="0"/>
+          <w:sz w:val="20"/>
+          <w:u w:val="none"/>
+        </w:rPr>
+        <w:t>The system operates as a single-clinic instance; multi-branch management is not supported.</w:t>
+      </w:r>
+    </w:p>
+    <w:p>
+      <w:pPr>
+        <w:pStyle w:val="ListBullet"/>
+      </w:pPr>
+      <w:r>
+        <w:rPr>
+          <w:b w:val="0"/>
+          <w:i w:val="0"/>
+          <w:sz w:val="20"/>
+          <w:u w:val="none"/>
+        </w:rPr>
+        <w:t>Role creation is fixed to predefined system roles; custom role definitions are not available in this version.</w:t>
       </w:r>
     </w:p>
     <w:p>
@@ -2056,6 +3433,12 @@
         <w:pStyle w:val="Heading3"/>
       </w:pPr>
       <w:r>
+        <w:rPr>
+          <w:b/>
+          <w:i w:val="0"/>
+          <w:sz w:val="22"/>
+          <w:u w:val="none"/>
+        </w:rPr>
         <w:t>Version 2.0.0 — Analytics &amp; Operations Expansion (Planned)</w:t>
       </w:r>
     </w:p>
@@ -2064,6 +3447,8 @@
         <w:rPr>
           <w:b/>
           <w:i w:val="0"/>
+          <w:sz w:val="20"/>
+          <w:u w:val="none"/>
         </w:rPr>
         <w:t xml:space="preserve">Release Date: </w:t>
       </w:r>
@@ -2071,6 +3456,8 @@
         <w:rPr>
           <w:b w:val="0"/>
           <w:i w:val="0"/>
+          <w:sz w:val="20"/>
+          <w:u w:val="none"/>
         </w:rPr>
         <w:t>TBD</w:t>
       </w:r>
@@ -2088,7 +3475,7 @@
         <w:jc w:val="both"/>
       </w:pPr>
       <w:r>
-        <w:t>Version 2.0.0 builds upon the foundational features of the initial release by introducing advanced analytics, exportable reporting, notification preference controls, and security hardening improvements. This release aims to close the operational loop of Medy-Care, enabling admins and clinic management to make data-driven decisions through a unified analytics dashboard.</w:t>
+        <w:t>Version 2.0.0 builds upon the foundational features of the initial release by introducing advanced analytics, exportable reporting, notification preference controls, and security hardening improvements. This release aims to close the operational loop of Medy-Care, enabling administrators and clinic management to make data-driven decisions through a unified analytics dashboard.</w:t>
       </w:r>
     </w:p>
     <w:p>
@@ -2096,18 +3483,37 @@
         <w:pStyle w:val="Heading4"/>
       </w:pPr>
       <w:r>
-        <w:t>Planned New Features</w:t>
+        <w:t>Features</w:t>
       </w:r>
     </w:p>
     <w:p>
       <w:pPr>
-        <w:pStyle w:val="ListBullet"/>
+        <w:pStyle w:val="Heading4"/>
+      </w:pPr>
+      <w:r>
+        <w:t>New Features</w:t>
+      </w:r>
+    </w:p>
+    <w:p>
+      <w:pPr>
+        <w:spacing w:after="80"/>
         <w:jc w:val="both"/>
       </w:pPr>
       <w:r>
         <w:rPr>
           <w:b/>
           <w:i w:val="0"/>
+          <w:sz w:val="20"/>
+          <w:u w:val="none"/>
+        </w:rPr>
+        <w:t xml:space="preserve">✓ </w:t>
+      </w:r>
+      <w:r>
+        <w:rPr>
+          <w:b/>
+          <w:i w:val="0"/>
+          <w:sz w:val="20"/>
+          <w:u w:val="none"/>
         </w:rPr>
         <w:t xml:space="preserve">Analytics Dashboard — </w:t>
       </w:r>
@@ -2115,19 +3521,32 @@
         <w:rPr>
           <w:b w:val="0"/>
           <w:i w:val="0"/>
+          <w:sz w:val="20"/>
+          <w:u w:val="none"/>
         </w:rPr>
         <w:t>KPI cards and trend charts for appointment activity, completion rates, and decline rates. Filterable by date range and scoped per role.</w:t>
       </w:r>
     </w:p>
     <w:p>
       <w:pPr>
-        <w:pStyle w:val="ListBullet"/>
+        <w:spacing w:after="80"/>
         <w:jc w:val="both"/>
       </w:pPr>
       <w:r>
         <w:rPr>
           <w:b/>
           <w:i w:val="0"/>
+          <w:sz w:val="20"/>
+          <w:u w:val="none"/>
+        </w:rPr>
+        <w:t xml:space="preserve">✓ </w:t>
+      </w:r>
+      <w:r>
+        <w:rPr>
+          <w:b/>
+          <w:i w:val="0"/>
+          <w:sz w:val="20"/>
+          <w:u w:val="none"/>
         </w:rPr>
         <w:t xml:space="preserve">Appointment History Exports — </w:t>
       </w:r>
@@ -2135,19 +3554,32 @@
         <w:rPr>
           <w:b w:val="0"/>
           <w:i w:val="0"/>
+          <w:sz w:val="20"/>
+          <w:u w:val="none"/>
         </w:rPr>
         <w:t>Admin can export filtered appointment history records in CSV or PDF format for audit and review purposes.</w:t>
       </w:r>
     </w:p>
     <w:p>
       <w:pPr>
-        <w:pStyle w:val="ListBullet"/>
+        <w:spacing w:after="80"/>
         <w:jc w:val="both"/>
       </w:pPr>
       <w:r>
         <w:rPr>
           <w:b/>
           <w:i w:val="0"/>
+          <w:sz w:val="20"/>
+          <w:u w:val="none"/>
+        </w:rPr>
+        <w:t xml:space="preserve">✓ </w:t>
+      </w:r>
+      <w:r>
+        <w:rPr>
+          <w:b/>
+          <w:i w:val="0"/>
+          <w:sz w:val="20"/>
+          <w:u w:val="none"/>
         </w:rPr>
         <w:t xml:space="preserve">Notification Preferences — </w:t>
       </w:r>
@@ -2155,19 +3587,32 @@
         <w:rPr>
           <w:b w:val="0"/>
           <w:i w:val="0"/>
+          <w:sz w:val="20"/>
+          <w:u w:val="none"/>
         </w:rPr>
         <w:t>Users can configure their preferred notification channels (in-app, email, SMS) from account settings.</w:t>
       </w:r>
     </w:p>
     <w:p>
       <w:pPr>
-        <w:pStyle w:val="ListBullet"/>
+        <w:spacing w:after="80"/>
         <w:jc w:val="both"/>
       </w:pPr>
       <w:r>
         <w:rPr>
           <w:b/>
           <w:i w:val="0"/>
+          <w:sz w:val="20"/>
+          <w:u w:val="none"/>
+        </w:rPr>
+        <w:t xml:space="preserve">✓ </w:t>
+      </w:r>
+      <w:r>
+        <w:rPr>
+          <w:b/>
+          <w:i w:val="0"/>
+          <w:sz w:val="20"/>
+          <w:u w:val="none"/>
         </w:rPr>
         <w:t xml:space="preserve">Security Hardening — </w:t>
       </w:r>
@@ -2175,6 +3620,8 @@
         <w:rPr>
           <w:b w:val="0"/>
           <w:i w:val="0"/>
+          <w:sz w:val="20"/>
+          <w:u w:val="none"/>
         </w:rPr>
         <w:t>Stronger session management controls, rate limiting on authentication endpoints, and enhanced audit logging for administrative actions.</w:t>
       </w:r>
@@ -2189,21 +3636,76 @@
     </w:p>
     <w:p>
       <w:pPr>
-        <w:pStyle w:val="ListBullet"/>
+        <w:spacing w:after="80"/>
+        <w:jc w:val="both"/>
       </w:pPr>
       <w:r>
         <w:rPr>
           <w:b/>
           <w:i w:val="0"/>
+          <w:sz w:val="20"/>
+          <w:u w:val="none"/>
         </w:rPr>
-        <w:t xml:space="preserve">↑ Reporting — </w:t>
+        <w:t xml:space="preserve">↑ </w:t>
+      </w:r>
+      <w:r>
+        <w:rPr>
+          <w:b/>
+          <w:i w:val="0"/>
+          <w:sz w:val="20"/>
+          <w:u w:val="none"/>
+        </w:rPr>
+        <w:t xml:space="preserve">Reporting — </w:t>
       </w:r>
       <w:r>
         <w:rPr>
           <w:b w:val="0"/>
           <w:i w:val="0"/>
+          <w:sz w:val="20"/>
+          <w:u w:val="none"/>
         </w:rPr>
         <w:t>Reports extended with cross-date filtering, exportable formats, and additional breakdowns by appointment type and nurse.</w:t>
+      </w:r>
+    </w:p>
+    <w:p>
+      <w:pPr>
+        <w:spacing w:after="80"/>
+        <w:jc w:val="both"/>
+      </w:pPr>
+      <w:r>
+        <w:rPr>
+          <w:b/>
+          <w:i w:val="0"/>
+          <w:sz w:val="20"/>
+          <w:u w:val="none"/>
+        </w:rPr>
+        <w:t xml:space="preserve">↑ </w:t>
+      </w:r>
+      <w:r>
+        <w:rPr>
+          <w:b/>
+          <w:i w:val="0"/>
+          <w:sz w:val="20"/>
+          <w:u w:val="none"/>
+        </w:rPr>
+        <w:t xml:space="preserve">Notifications — </w:t>
+      </w:r>
+      <w:r>
+        <w:rPr>
+          <w:b w:val="0"/>
+          <w:i w:val="0"/>
+          <w:sz w:val="20"/>
+          <w:u w:val="none"/>
+        </w:rPr>
+        <w:t>Notification delivery extended to support email and SMS channels alongside in-app alerts.</w:t>
+      </w:r>
+    </w:p>
+    <w:p>
+      <w:pPr>
+        <w:pStyle w:val="Heading4"/>
+      </w:pPr>
+      <w:r>
+        <w:t>Technical Details</w:t>
       </w:r>
     </w:p>
     <w:p>
@@ -2212,17 +3714,160 @@
       </w:pPr>
       <w:r>
         <w:rPr>
+          <w:b w:val="0"/>
+          <w:i w:val="0"/>
+          <w:sz w:val="20"/>
+          <w:u w:val="none"/>
+        </w:rPr>
+        <w:t>Laravel Queue for asynchronous processing of notification dispatch and report generation.</w:t>
+      </w:r>
+    </w:p>
+    <w:p>
+      <w:pPr>
+        <w:pStyle w:val="ListBullet"/>
+      </w:pPr>
+      <w:r>
+        <w:rPr>
+          <w:b w:val="0"/>
+          <w:i w:val="0"/>
+          <w:sz w:val="20"/>
+          <w:u w:val="none"/>
+        </w:rPr>
+        <w:t>PWA Service Worker with Web Push notifications for appointment alerts.</w:t>
+      </w:r>
+    </w:p>
+    <w:p>
+      <w:pPr>
+        <w:pStyle w:val="ListBullet"/>
+      </w:pPr>
+      <w:r>
+        <w:rPr>
+          <w:b w:val="0"/>
+          <w:i w:val="0"/>
+          <w:sz w:val="20"/>
+          <w:u w:val="none"/>
+        </w:rPr>
+        <w:t>Laravel Mail for automated email delivery to users upon key system events.</w:t>
+      </w:r>
+    </w:p>
+    <w:p>
+      <w:pPr>
+        <w:pStyle w:val="ListBullet"/>
+      </w:pPr>
+      <w:r>
+        <w:rPr>
+          <w:b w:val="0"/>
+          <w:i w:val="0"/>
+          <w:sz w:val="20"/>
+          <w:u w:val="none"/>
+        </w:rPr>
+        <w:t>Multi-channel notification driver with per-user preference storage.</w:t>
+      </w:r>
+    </w:p>
+    <w:p>
+      <w:pPr>
+        <w:pStyle w:val="Heading4"/>
+      </w:pPr>
+      <w:r>
+        <w:t>Known Issues</w:t>
+      </w:r>
+    </w:p>
+    <w:p>
+      <w:pPr>
+        <w:pStyle w:val="ListBullet"/>
+        <w:jc w:val="both"/>
+      </w:pPr>
+      <w:r>
+        <w:rPr>
           <w:b/>
           <w:i w:val="0"/>
+          <w:sz w:val="20"/>
+          <w:u w:val="none"/>
         </w:rPr>
-        <w:t xml:space="preserve">↑ Notifications — </w:t>
+        <w:t xml:space="preserve">Analytics cross-filtering — </w:t>
       </w:r>
       <w:r>
         <w:rPr>
           <w:b w:val="0"/>
           <w:i w:val="0"/>
+          <w:sz w:val="20"/>
+          <w:u w:val="none"/>
         </w:rPr>
-        <w:t>Notification delivery extended to support email and SMS channels alongside in-app alerts.</w:t>
+        <w:t>Cross-role analytics aggregation may have performance limitations on large datasets in early releases.</w:t>
+      </w:r>
+    </w:p>
+    <w:p>
+      <w:pPr>
+        <w:pStyle w:val="ListBullet"/>
+        <w:jc w:val="both"/>
+      </w:pPr>
+      <w:r>
+        <w:rPr>
+          <w:b/>
+          <w:i w:val="0"/>
+          <w:sz w:val="20"/>
+          <w:u w:val="none"/>
+        </w:rPr>
+        <w:t xml:space="preserve">Export formatting — </w:t>
+      </w:r>
+      <w:r>
+        <w:rPr>
+          <w:b w:val="0"/>
+          <w:i w:val="0"/>
+          <w:sz w:val="20"/>
+          <w:u w:val="none"/>
+        </w:rPr>
+        <w:t>PDF export layout is subject to revision; complex table structures may render differently across viewers.</w:t>
+      </w:r>
+    </w:p>
+    <w:p>
+      <w:pPr>
+        <w:pStyle w:val="Heading4"/>
+      </w:pPr>
+      <w:r>
+        <w:t>Limitations</w:t>
+      </w:r>
+    </w:p>
+    <w:p>
+      <w:pPr>
+        <w:pStyle w:val="ListBullet"/>
+      </w:pPr>
+      <w:r>
+        <w:rPr>
+          <w:b w:val="0"/>
+          <w:i w:val="0"/>
+          <w:sz w:val="20"/>
+          <w:u w:val="none"/>
+        </w:rPr>
+        <w:t>Cash flow and financial reporting are not in scope for this version; reserved for a future module.</w:t>
+      </w:r>
+    </w:p>
+    <w:p>
+      <w:pPr>
+        <w:pStyle w:val="ListBullet"/>
+      </w:pPr>
+      <w:r>
+        <w:rPr>
+          <w:b w:val="0"/>
+          <w:i w:val="0"/>
+          <w:sz w:val="20"/>
+          <w:u w:val="none"/>
+        </w:rPr>
+        <w:t>Multi-clinic (branch) management is not supported; the system remains a single-clinic instance.</w:t>
+      </w:r>
+    </w:p>
+    <w:p>
+      <w:pPr>
+        <w:pStyle w:val="ListBullet"/>
+      </w:pPr>
+      <w:r>
+        <w:rPr>
+          <w:b w:val="0"/>
+          <w:i w:val="0"/>
+          <w:sz w:val="20"/>
+          <w:u w:val="none"/>
+        </w:rPr>
+        <w:t>Multi-level approval workflows are not supported in this version; single-level admin approval only.</w:t>
       </w:r>
     </w:p>
     <w:sectPr>

</xml_diff>

<commit_message>
Update btch.docx to match latest repo changes
Agent-Logs-Url: https://github.com/3dward22/medy-care/sessions/54084778-b1ea-4ecb-a4c2-95b3376fabac

Co-authored-by: 3dward22 <159800005+3dward22@users.noreply.github.com>
</commit_message>
<xml_diff>
--- a/btch.docx
+++ b/btch.docx
@@ -1520,6 +1520,68 @@
       <w:tr>
         <w:tc>
           <w:tcPr>
+            <w:tcW w:type="dxa" w:w="8674"/>
+            <w:gridSpan w:val="2"/>
+            <w:tcBorders>
+              <w:top w:val="single" w:sz="4" w:space="0" w:color="596B3B"/>
+              <w:left w:val="single" w:sz="4" w:space="0" w:color="596B3B"/>
+              <w:bottom w:val="single" w:sz="4" w:space="0" w:color="596B3B"/>
+              <w:right w:val="single" w:sz="4" w:space="0" w:color="596B3B"/>
+              <w:insideH w:val="single" w:sz="4" w:space="0" w:color="596B3B"/>
+              <w:insideV w:val="single" w:sz="4" w:space="0" w:color="596B3B"/>
+            </w:tcBorders>
+          </w:tcPr>
+          <w:p>
+            <w:pPr>
+              <w:spacing w:before="20" w:after="20"/>
+              <w:ind w:left="283"/>
+            </w:pPr>
+            <w:r>
+              <w:rPr>
+                <w:b w:val="0"/>
+                <w:i w:val="0"/>
+                <w:sz w:val="18"/>
+                <w:u w:val="none"/>
+              </w:rPr>
+              <w:t>• Nurse can record vitals (temperature, blood pressure, heart rate) per emergency.</w:t>
+            </w:r>
+          </w:p>
+        </w:tc>
+      </w:tr>
+      <w:tr>
+        <w:tc>
+          <w:tcPr>
+            <w:tcW w:type="dxa" w:w="8674"/>
+            <w:gridSpan w:val="2"/>
+            <w:tcBorders>
+              <w:top w:val="single" w:sz="4" w:space="0" w:color="596B3B"/>
+              <w:left w:val="single" w:sz="4" w:space="0" w:color="596B3B"/>
+              <w:bottom w:val="single" w:sz="4" w:space="0" w:color="596B3B"/>
+              <w:right w:val="single" w:sz="4" w:space="0" w:color="596B3B"/>
+              <w:insideH w:val="single" w:sz="4" w:space="0" w:color="596B3B"/>
+              <w:insideV w:val="single" w:sz="4" w:space="0" w:color="596B3B"/>
+            </w:tcBorders>
+          </w:tcPr>
+          <w:p>
+            <w:pPr>
+              <w:spacing w:before="20" w:after="20"/>
+              <w:ind w:left="283"/>
+            </w:pPr>
+            <w:r>
+              <w:rPr>
+                <w:b w:val="0"/>
+                <w:i w:val="0"/>
+                <w:sz w:val="18"/>
+                <w:u w:val="none"/>
+              </w:rPr>
+              <w:t>• Emergency records include reason, complaint, findings, and notes fields.</w:t>
+            </w:r>
+          </w:p>
+        </w:tc>
+      </w:tr>
+      <w:tr>
+        <w:tc>
+          <w:tcPr>
             <w:tcW w:type="dxa" w:w="2154"/>
             <w:shd w:val="clear" w:color="auto" w:fill="7F9443"/>
             <w:tcBorders>
@@ -1945,6 +2007,68 @@
       <w:tr>
         <w:tc>
           <w:tcPr>
+            <w:tcW w:type="dxa" w:w="8674"/>
+            <w:gridSpan w:val="2"/>
+            <w:tcBorders>
+              <w:top w:val="single" w:sz="4" w:space="0" w:color="596B3B"/>
+              <w:left w:val="single" w:sz="4" w:space="0" w:color="596B3B"/>
+              <w:bottom w:val="single" w:sz="4" w:space="0" w:color="596B3B"/>
+              <w:right w:val="single" w:sz="4" w:space="0" w:color="596B3B"/>
+              <w:insideH w:val="single" w:sz="4" w:space="0" w:color="596B3B"/>
+              <w:insideV w:val="single" w:sz="4" w:space="0" w:color="596B3B"/>
+            </w:tcBorders>
+          </w:tcPr>
+          <w:p>
+            <w:pPr>
+              <w:spacing w:before="20" w:after="20"/>
+              <w:ind w:left="283"/>
+            </w:pPr>
+            <w:r>
+              <w:rPr>
+                <w:b w:val="0"/>
+                <w:i w:val="0"/>
+                <w:sz w:val="18"/>
+                <w:u w:val="none"/>
+              </w:rPr>
+              <w:t>• Guardian name and phone are collected at student registration and auto-filled when composing SMS.</w:t>
+            </w:r>
+          </w:p>
+        </w:tc>
+      </w:tr>
+      <w:tr>
+        <w:tc>
+          <w:tcPr>
+            <w:tcW w:type="dxa" w:w="8674"/>
+            <w:gridSpan w:val="2"/>
+            <w:tcBorders>
+              <w:top w:val="single" w:sz="4" w:space="0" w:color="596B3B"/>
+              <w:left w:val="single" w:sz="4" w:space="0" w:color="596B3B"/>
+              <w:bottom w:val="single" w:sz="4" w:space="0" w:color="596B3B"/>
+              <w:right w:val="single" w:sz="4" w:space="0" w:color="596B3B"/>
+              <w:insideH w:val="single" w:sz="4" w:space="0" w:color="596B3B"/>
+              <w:insideV w:val="single" w:sz="4" w:space="0" w:color="596B3B"/>
+            </w:tcBorders>
+          </w:tcPr>
+          <w:p>
+            <w:pPr>
+              <w:spacing w:before="20" w:after="20"/>
+              <w:ind w:left="283"/>
+            </w:pPr>
+            <w:r>
+              <w:rPr>
+                <w:b w:val="0"/>
+                <w:i w:val="0"/>
+                <w:sz w:val="18"/>
+                <w:u w:val="none"/>
+              </w:rPr>
+              <w:t>• SMS log access is role-scoped: nurses see their own logs; admins see all.</w:t>
+            </w:r>
+          </w:p>
+        </w:tc>
+      </w:tr>
+      <w:tr>
+        <w:tc>
+          <w:tcPr>
             <w:tcW w:type="dxa" w:w="2154"/>
             <w:shd w:val="clear" w:color="auto" w:fill="7F9443"/>
             <w:tcBorders>
@@ -2071,7 +2195,7 @@
                 <w:sz w:val="18"/>
                 <w:u w:val="none"/>
               </w:rPr>
-              <w:t>• Admin can generate monthly appointment activity reports.</w:t>
+              <w:t>• Admin can generate and download monthly appointment reports as a PDF.</w:t>
             </w:r>
           </w:p>
         </w:tc>
@@ -2102,7 +2226,209 @@
                 <w:sz w:val="18"/>
                 <w:u w:val="none"/>
               </w:rPr>
-              <w:t>• Reports display aggregated counts and status breakdowns.</w:t>
+              <w:t>• Reports display aggregated counts, status breakdowns, and illness/sickness frequency.</w:t>
+            </w:r>
+          </w:p>
+        </w:tc>
+      </w:tr>
+      <w:tr>
+        <w:tc>
+          <w:tcPr>
+            <w:tcW w:type="dxa" w:w="2154"/>
+            <w:shd w:val="clear" w:color="auto" w:fill="7F9443"/>
+            <w:tcBorders>
+              <w:top w:val="single" w:sz="4" w:space="0" w:color="596B3B"/>
+              <w:left w:val="single" w:sz="4" w:space="0" w:color="596B3B"/>
+              <w:bottom w:val="single" w:sz="4" w:space="0" w:color="596B3B"/>
+              <w:right w:val="single" w:sz="4" w:space="0" w:color="596B3B"/>
+              <w:insideH w:val="single" w:sz="4" w:space="0" w:color="596B3B"/>
+              <w:insideV w:val="single" w:sz="4" w:space="0" w:color="596B3B"/>
+            </w:tcBorders>
+          </w:tcPr>
+          <w:p>
+            <w:pPr>
+              <w:spacing w:before="40" w:after="40"/>
+              <w:jc w:val="center"/>
+            </w:pPr>
+            <w:r>
+              <w:rPr>
+                <w:b/>
+                <w:i w:val="0"/>
+                <w:color w:val="FFFFFF"/>
+                <w:sz w:val="18"/>
+                <w:u w:val="none"/>
+              </w:rPr>
+              <w:t>Nurse
+Referral
+Form</w:t>
+              <w:br/>
+              <w:t/>
+              <w:br/>
+              <w:t/>
+            </w:r>
+          </w:p>
+        </w:tc>
+        <w:tc>
+          <w:tcPr>
+            <w:tcW w:type="dxa" w:w="6520"/>
+            <w:shd w:val="clear" w:color="auto" w:fill="7F9443"/>
+            <w:tcBorders>
+              <w:top w:val="single" w:sz="4" w:space="0" w:color="596B3B"/>
+              <w:left w:val="single" w:sz="4" w:space="0" w:color="596B3B"/>
+              <w:bottom w:val="single" w:sz="4" w:space="0" w:color="596B3B"/>
+              <w:right w:val="single" w:sz="4" w:space="0" w:color="596B3B"/>
+              <w:insideH w:val="single" w:sz="4" w:space="0" w:color="596B3B"/>
+              <w:insideV w:val="single" w:sz="4" w:space="0" w:color="596B3B"/>
+            </w:tcBorders>
+          </w:tcPr>
+          <w:p>
+            <w:pPr>
+              <w:spacing w:before="40" w:after="40"/>
+              <w:jc w:val="both"/>
+            </w:pPr>
+            <w:r>
+              <w:rPr>
+                <w:b/>
+                <w:i w:val="0"/>
+                <w:color w:val="FFFFFF"/>
+                <w:sz w:val="18"/>
+                <w:u w:val="none"/>
+              </w:rPr>
+              <w:t xml:space="preserve">User Story: As a nurse, I want to complete and download a hospital referral form so that I can formally refer patients to external healthcare facilities.</w:t>
+            </w:r>
+            <w:r>
+              <w:rPr>
+                <w:b w:val="0"/>
+                <w:i w:val="0"/>
+                <w:color w:val="FFFFFF"/>
+                <w:sz w:val="18"/>
+                <w:u w:val="none"/>
+              </w:rPr>
+              <w:t/>
+            </w:r>
+          </w:p>
+        </w:tc>
+      </w:tr>
+      <w:tr>
+        <w:tc>
+          <w:tcPr>
+            <w:tcW w:type="dxa" w:w="8674"/>
+            <w:gridSpan w:val="2"/>
+            <w:tcBorders>
+              <w:top w:val="single" w:sz="4" w:space="0" w:color="596B3B"/>
+              <w:left w:val="single" w:sz="4" w:space="0" w:color="596B3B"/>
+              <w:bottom w:val="single" w:sz="4" w:space="0" w:color="596B3B"/>
+              <w:right w:val="single" w:sz="4" w:space="0" w:color="596B3B"/>
+              <w:insideH w:val="single" w:sz="4" w:space="0" w:color="596B3B"/>
+              <w:insideV w:val="single" w:sz="4" w:space="0" w:color="596B3B"/>
+            </w:tcBorders>
+          </w:tcPr>
+          <w:p>
+            <w:pPr>
+              <w:spacing w:before="40" w:after="20"/>
+              <w:ind w:left="113"/>
+            </w:pPr>
+            <w:r>
+              <w:rPr>
+                <w:b/>
+                <w:i w:val="0"/>
+                <w:sz w:val="18"/>
+                <w:u w:val="none"/>
+              </w:rPr>
+              <w:t>Tasks:</w:t>
+            </w:r>
+          </w:p>
+        </w:tc>
+      </w:tr>
+      <w:tr>
+        <w:tc>
+          <w:tcPr>
+            <w:tcW w:type="dxa" w:w="8674"/>
+            <w:gridSpan w:val="2"/>
+            <w:tcBorders>
+              <w:top w:val="single" w:sz="4" w:space="0" w:color="596B3B"/>
+              <w:left w:val="single" w:sz="4" w:space="0" w:color="596B3B"/>
+              <w:bottom w:val="single" w:sz="4" w:space="0" w:color="596B3B"/>
+              <w:right w:val="single" w:sz="4" w:space="0" w:color="596B3B"/>
+              <w:insideH w:val="single" w:sz="4" w:space="0" w:color="596B3B"/>
+              <w:insideV w:val="single" w:sz="4" w:space="0" w:color="596B3B"/>
+            </w:tcBorders>
+          </w:tcPr>
+          <w:p>
+            <w:pPr>
+              <w:spacing w:before="20" w:after="20"/>
+              <w:ind w:left="283"/>
+            </w:pPr>
+            <w:r>
+              <w:rPr>
+                <w:b w:val="0"/>
+                <w:i w:val="0"/>
+                <w:sz w:val="18"/>
+                <w:u w:val="none"/>
+              </w:rPr>
+              <w:t>• Nurse can fill out a structured referral form with patient and clinical details.</w:t>
+            </w:r>
+          </w:p>
+        </w:tc>
+      </w:tr>
+      <w:tr>
+        <w:tc>
+          <w:tcPr>
+            <w:tcW w:type="dxa" w:w="8674"/>
+            <w:gridSpan w:val="2"/>
+            <w:tcBorders>
+              <w:top w:val="single" w:sz="4" w:space="0" w:color="596B3B"/>
+              <w:left w:val="single" w:sz="4" w:space="0" w:color="596B3B"/>
+              <w:bottom w:val="single" w:sz="4" w:space="0" w:color="596B3B"/>
+              <w:right w:val="single" w:sz="4" w:space="0" w:color="596B3B"/>
+              <w:insideH w:val="single" w:sz="4" w:space="0" w:color="596B3B"/>
+              <w:insideV w:val="single" w:sz="4" w:space="0" w:color="596B3B"/>
+            </w:tcBorders>
+          </w:tcPr>
+          <w:p>
+            <w:pPr>
+              <w:spacing w:before="20" w:after="20"/>
+              <w:ind w:left="283"/>
+            </w:pPr>
+            <w:r>
+              <w:rPr>
+                <w:b w:val="0"/>
+                <w:i w:val="0"/>
+                <w:sz w:val="18"/>
+                <w:u w:val="none"/>
+              </w:rPr>
+              <w:t>• Form includes hospital details, patient info, relative contact, clinical history, and treatment observations.</w:t>
+            </w:r>
+          </w:p>
+        </w:tc>
+      </w:tr>
+      <w:tr>
+        <w:tc>
+          <w:tcPr>
+            <w:tcW w:type="dxa" w:w="8674"/>
+            <w:gridSpan w:val="2"/>
+            <w:tcBorders>
+              <w:top w:val="single" w:sz="4" w:space="0" w:color="596B3B"/>
+              <w:left w:val="single" w:sz="4" w:space="0" w:color="596B3B"/>
+              <w:bottom w:val="single" w:sz="4" w:space="0" w:color="596B3B"/>
+              <w:right w:val="single" w:sz="4" w:space="0" w:color="596B3B"/>
+              <w:insideH w:val="single" w:sz="4" w:space="0" w:color="596B3B"/>
+              <w:insideV w:val="single" w:sz="4" w:space="0" w:color="596B3B"/>
+            </w:tcBorders>
+          </w:tcPr>
+          <w:p>
+            <w:pPr>
+              <w:spacing w:before="20" w:after="20"/>
+              <w:ind w:left="283"/>
+            </w:pPr>
+            <w:r>
+              <w:rPr>
+                <w:b w:val="0"/>
+                <w:i w:val="0"/>
+                <w:sz w:val="18"/>
+                <w:u w:val="none"/>
+              </w:rPr>
+              <w:t>• Nurse can download the completed referral as a printable PDF document.</w:t>
             </w:r>
           </w:p>
         </w:tc>
@@ -3081,7 +3407,7 @@
           <w:sz w:val="20"/>
           <w:u w:val="none"/>
         </w:rPr>
-        <w:t xml:space="preserve">✓ </w:t>
+        <w:t>✓ Clinical Records — Nurses have access to student medical records and can create emergency records for urgent cases. Emergency records capture vitals (temperature, blood pressure, heart rate), along with reason, complaint, findings, notes, and a diagnosis. All records are stored with timestamps and accessible through dedicated listing and detail views.</w:t>
       </w:r>
       <w:r>
         <w:rPr>
@@ -3090,7 +3416,6 @@
           <w:sz w:val="20"/>
           <w:u w:val="none"/>
         </w:rPr>
-        <w:t xml:space="preserve">Clinical Records — </w:t>
       </w:r>
       <w:r>
         <w:rPr>
@@ -3099,7 +3424,6 @@
           <w:sz w:val="20"/>
           <w:u w:val="none"/>
         </w:rPr>
-        <w:t>Nurses have access to student medical records and can create emergency records for urgent cases. All records are stored with timestamps and accessible through dedicated listing and detail views.</w:t>
       </w:r>
     </w:p>
     <w:p>
@@ -3147,7 +3471,7 @@
           <w:sz w:val="20"/>
           <w:u w:val="none"/>
         </w:rPr>
-        <w:t xml:space="preserve">✓ </w:t>
+        <w:t>✓ Guardian Communication — Clinic staff can send SMS messages to student guardians both manually via a modal interface and through appointment-linked triggers. Guardian name and phone number are collected during student registration and auto-filled when composing messages. All sent messages are logged in the Guardian SMS module, with role-based access (nurses see their own logs; admins see all).</w:t>
       </w:r>
       <w:r>
         <w:rPr>
@@ -3156,7 +3480,6 @@
           <w:sz w:val="20"/>
           <w:u w:val="none"/>
         </w:rPr>
-        <w:t xml:space="preserve">Guardian Communication — </w:t>
       </w:r>
       <w:r>
         <w:rPr>
@@ -3165,7 +3488,6 @@
           <w:sz w:val="20"/>
           <w:u w:val="none"/>
         </w:rPr>
-        <w:t>Clinic staff can send SMS messages to student guardians both manually and through appointment-linked triggers. All sent messages are logged in the Guardian SMS module.</w:t>
       </w:r>
     </w:p>
     <w:p>
@@ -3180,7 +3502,7 @@
           <w:sz w:val="20"/>
           <w:u w:val="none"/>
         </w:rPr>
-        <w:t xml:space="preserve">✓ </w:t>
+        <w:t>✓ Reporting — Monthly report generation for appointment activity, exported as a downloadable PDF. Reports include aggregated appointment counts, status breakdowns, and an illness/sickness frequency table for oversight and planning.</w:t>
       </w:r>
       <w:r>
         <w:rPr>
@@ -3189,7 +3511,6 @@
           <w:sz w:val="20"/>
           <w:u w:val="none"/>
         </w:rPr>
-        <w:t xml:space="preserve">Reporting — </w:t>
       </w:r>
       <w:r>
         <w:rPr>
@@ -3198,7 +3519,37 @@
           <w:sz w:val="20"/>
           <w:u w:val="none"/>
         </w:rPr>
-        <w:t>Monthly report generation for appointment activity, providing administrators with aggregated counts and status breakdowns for oversight and planning.</w:t>
+      </w:r>
+    </w:p>
+    <w:p>
+      <w:pPr>
+        <w:spacing w:after="80"/>
+        <w:jc w:val="both"/>
+      </w:pPr>
+      <w:r>
+        <w:rPr>
+          <w:b/>
+          <w:i w:val="0"/>
+          <w:sz w:val="20"/>
+          <w:u w:val="none"/>
+        </w:rPr>
+        <w:t>✓ Nurse Referral Form — Nurses can complete a structured hospital referral form capturing patient information, relative contacts, clinical history, and treatment observations. The completed form can be downloaded as a formatted PDF for submission to external healthcare facilities.</w:t>
+      </w:r>
+      <w:r>
+        <w:rPr>
+          <w:b/>
+          <w:i w:val="0"/>
+          <w:sz w:val="20"/>
+          <w:u w:val="none"/>
+        </w:rPr>
+      </w:r>
+      <w:r>
+        <w:rPr>
+          <w:b w:val="0"/>
+          <w:i w:val="0"/>
+          <w:sz w:val="20"/>
+          <w:u w:val="none"/>
+        </w:rPr>
       </w:r>
     </w:p>
     <w:p>
@@ -3333,30 +3684,6 @@
           <w:u w:val="none"/>
         </w:rPr>
         <w:t>Appointment-linked SMS triggers may require manual initiation in some edge cases.</w:t>
-      </w:r>
-    </w:p>
-    <w:p>
-      <w:pPr>
-        <w:pStyle w:val="ListBullet"/>
-        <w:jc w:val="both"/>
-      </w:pPr>
-      <w:r>
-        <w:rPr>
-          <w:b/>
-          <w:i w:val="0"/>
-          <w:sz w:val="20"/>
-          <w:u w:val="none"/>
-        </w:rPr>
-        <w:t xml:space="preserve">Report export — </w:t>
-      </w:r>
-      <w:r>
-        <w:rPr>
-          <w:b w:val="0"/>
-          <w:i w:val="0"/>
-          <w:sz w:val="20"/>
-          <w:u w:val="none"/>
-        </w:rPr>
-        <w:t>Monthly reports are viewable on-screen only; export to PDF or CSV is not yet supported.</w:t>
       </w:r>
     </w:p>
     <w:p>

</xml_diff>